<commit_message>
docs: update author information to Hồ Khánh Linh
</commit_message>
<xml_diff>
--- a/BookingHomestay_SRS.docx
+++ b/BookingHomestay_SRS.docx
@@ -7,11 +7,7 @@
         <w:jc w:val="center"/>
         <w:rPr/>
       </w:pPr>
-      <w:r>
-        <w:rPr>
-          <w:rtl w:val="0"/>
-        </w:rPr>
-      </w:r>
+      <w:r/>
     </w:p>
     <w:p>
       <w:pPr>
@@ -25,11 +21,7 @@
           <w:szCs w:val="26"/>
         </w:rPr>
       </w:pPr>
-      <w:r>
-        <w:rPr>
-          <w:rtl w:val="0"/>
-        </w:rPr>
-      </w:r>
+      <w:r/>
     </w:p>
     <w:p>
       <w:pPr>
@@ -44,11 +36,7 @@
           <w:szCs w:val="26"/>
         </w:rPr>
       </w:pPr>
-      <w:r>
-        <w:rPr>
-          <w:rtl w:val="0"/>
-        </w:rPr>
-      </w:r>
+      <w:r/>
     </w:p>
     <w:p>
       <w:pPr>
@@ -63,11 +51,7 @@
           <w:szCs w:val="26"/>
         </w:rPr>
       </w:pPr>
-      <w:r>
-        <w:rPr>
-          <w:rtl w:val="0"/>
-        </w:rPr>
-      </w:r>
+      <w:r/>
     </w:p>
     <w:p>
       <w:pPr>
@@ -85,15 +69,7 @@
         </w:rPr>
       </w:pPr>
       <w:r>
-        <w:rPr>
-          <w:b w:val="1"/>
-          <w:bCs w:val="1"/>
-          <w:color w:val="000000"/>
-          <w:sz w:val="48"/>
-          <w:szCs w:val="48"/>
-          <w:rtl w:val="0"/>
-        </w:rPr>
-        <w:t xml:space="preserve">TÀI LIỆU ĐẶC TẢ NGHIỆP VỤ</w:t>
+        <w:t>TÀI LIỆU ĐẶC TẢ NGHIỆP VỤ</w:t>
       </w:r>
     </w:p>
     <w:p>
@@ -112,15 +88,7 @@
         </w:rPr>
       </w:pPr>
       <w:r>
-        <w:rPr>
-          <w:b w:val="1"/>
-          <w:bCs w:val="1"/>
-          <w:color w:val="000000"/>
-          <w:sz w:val="48"/>
-          <w:szCs w:val="48"/>
-          <w:rtl w:val="0"/>
-        </w:rPr>
-        <w:t xml:space="preserve">Quản lý tài khoản</w:t>
+        <w:t>Quản lý tài khoản</w:t>
       </w:r>
     </w:p>
     <w:p>
@@ -155,11 +123,7 @@
           <w:color w:val="000000"/>
         </w:rPr>
       </w:pPr>
-      <w:r>
-        <w:rPr>
-          <w:rtl w:val="0"/>
-        </w:rPr>
-      </w:r>
+      <w:r/>
     </w:p>
     <w:p>
       <w:pPr>
@@ -176,11 +140,7 @@
           <w:szCs w:val="48"/>
         </w:rPr>
       </w:pPr>
-      <w:r>
-        <w:rPr>
-          <w:rtl w:val="0"/>
-        </w:rPr>
-      </w:r>
+      <w:r/>
     </w:p>
     <w:p>
       <w:pPr>
@@ -199,7 +159,7 @@
         </w:rPr>
       </w:pPr>
       <w:r>
-        <w:t>Người thực hiện : Nhóm 1 - Đặng Thành Trung, Phạm Thị Hằng, Nguyễn Văn A, Nguyễn Văn X, Lê Thị Y, Bùi Thanh Z</w:t>
+        <w:t>Người thực hiện : Nhóm 1 - Hồ Khánh Linh, Hồ Khánh Linh, Hồ Khánh Linh, Hồ Khánh Linh, Hồ Khánh Linh, Hồ Khánh Linh</w:t>
       </w:r>
     </w:p>
     <w:p>
@@ -274,16 +234,14 @@
           <w:szCs w:val="26"/>
         </w:rPr>
         <w:sectPr>
+          <w:headerReference w:type="default" r:id="rId7"/>
+          <w:footerReference w:type="default" r:id="rId8"/>
           <w:pgSz w:h="16840" w:w="11907" w:orient="portrait"/>
           <w:pgMar w:bottom="1134" w:top="1134" w:left="1701" w:right="992" w:header="720" w:footer="720"/>
           <w:pgNumType w:start="1"/>
         </w:sectPr>
       </w:pPr>
-      <w:r>
-        <w:rPr>
-          <w:rtl w:val="0"/>
-        </w:rPr>
-      </w:r>
+      <w:r/>
     </w:p>
     <w:p>
       <w:pPr>
@@ -318,11 +276,7 @@
           <w:vertAlign w:val="baseline"/>
         </w:rPr>
       </w:pPr>
-      <w:r>
-        <w:rPr>
-          <w:rtl w:val="0"/>
-        </w:rPr>
-      </w:r>
+      <w:r/>
     </w:p>
     <w:p>
       <w:pPr>
@@ -357,11 +311,7 @@
           <w:vertAlign w:val="baseline"/>
         </w:rPr>
       </w:pPr>
-      <w:r>
-        <w:rPr>
-          <w:rtl w:val="0"/>
-        </w:rPr>
-      </w:r>
+      <w:r/>
     </w:p>
     <w:tbl>
       <w:tblPr>
@@ -411,13 +361,7 @@
               </w:rPr>
             </w:pPr>
             <w:r>
-              <w:rPr>
-                <w:b w:val="1"/>
-                <w:bCs w:val="1"/>
-                <w:color w:val="172b4d"/>
-                <w:rtl w:val="0"/>
-              </w:rPr>
-              <w:t xml:space="preserve">Trạng thái tài liệu</w:t>
+              <w:t>Trạng thái tài liệu</w:t>
             </w:r>
           </w:p>
         </w:tc>
@@ -470,28 +414,7 @@
               </w:rPr>
             </w:pPr>
             <w:r>
-              <w:rPr>
-                <w:rFonts w:ascii="Times New Roman" w:cs="Times New Roman" w:eastAsia="Times New Roman" w:hAnsi="Times New Roman"/>
-                <w:b w:val="1"/>
-                <w:bCs w:val="1"/>
-                <w:i w:val="0"/>
-                <w:iCs w:val="0"/>
-                <w:smallCaps w:val="1"/>
-                <w:strike w:val="0"/>
-                <w:color w:val="ffffff"/>
-                <w:sz w:val="24"/>
-                <w:szCs w:val="24"/>
-                <w:u w:val="none"/>
-                <w:shd w:fill="auto" w:val="clear"/>
-                <w:vertAlign w:val="baseline"/>
-                <w:rtl w:val="0"/>
-              </w:rPr>
-              <w:t xml:space="preserve">DRAFT</w:t>
-            </w:r>
-            <w:r>
-              <w:rPr>
-                <w:rtl w:val="0"/>
-              </w:rPr>
+              <w:t>DRAFT</w:t>
             </w:r>
           </w:p>
         </w:tc>
@@ -526,13 +449,7 @@
               </w:rPr>
             </w:pPr>
             <w:r>
-              <w:rPr>
-                <w:b w:val="1"/>
-                <w:bCs w:val="1"/>
-                <w:color w:val="172b4d"/>
-                <w:rtl w:val="0"/>
-              </w:rPr>
-              <w:t xml:space="preserve">Người viết</w:t>
+              <w:t>Người viết</w:t>
             </w:r>
           </w:p>
         </w:tc>
@@ -584,11 +501,7 @@
                 <w:vertAlign w:val="baseline"/>
               </w:rPr>
             </w:pPr>
-            <w:r>
-              <w:rPr>
-                <w:rtl w:val="0"/>
-              </w:rPr>
-            </w:r>
+            <w:r/>
           </w:p>
         </w:tc>
       </w:tr>
@@ -622,13 +535,7 @@
               </w:rPr>
             </w:pPr>
             <w:r>
-              <w:rPr>
-                <w:b w:val="1"/>
-                <w:bCs w:val="1"/>
-                <w:color w:val="172b4d"/>
-                <w:rtl w:val="0"/>
-              </w:rPr>
-              <w:t xml:space="preserve">Người review</w:t>
+              <w:t>Người review</w:t>
             </w:r>
           </w:p>
         </w:tc>
@@ -680,11 +587,7 @@
                 <w:vertAlign w:val="baseline"/>
               </w:rPr>
             </w:pPr>
-            <w:r>
-              <w:rPr>
-                <w:rtl w:val="0"/>
-              </w:rPr>
-            </w:r>
+            <w:r/>
           </w:p>
         </w:tc>
       </w:tr>
@@ -718,13 +621,7 @@
               </w:rPr>
             </w:pPr>
             <w:r>
-              <w:rPr>
-                <w:b w:val="1"/>
-                <w:bCs w:val="1"/>
-                <w:color w:val="172b4d"/>
-                <w:rtl w:val="0"/>
-              </w:rPr>
-              <w:t xml:space="preserve">Người phê duyệt</w:t>
+              <w:t>Người phê duyệt</w:t>
             </w:r>
           </w:p>
         </w:tc>
@@ -747,11 +644,7 @@
             <w:pPr>
               <w:rPr/>
             </w:pPr>
-            <w:r>
-              <w:rPr>
-                <w:rtl w:val="0"/>
-              </w:rPr>
-            </w:r>
+            <w:r/>
           </w:p>
         </w:tc>
       </w:tr>
@@ -785,13 +678,7 @@
               </w:rPr>
             </w:pPr>
             <w:r>
-              <w:rPr>
-                <w:b w:val="1"/>
-                <w:bCs w:val="1"/>
-                <w:color w:val="172b4d"/>
-                <w:rtl w:val="0"/>
-              </w:rPr>
-              <w:t xml:space="preserve">QA</w:t>
+              <w:t>QA</w:t>
             </w:r>
           </w:p>
         </w:tc>
@@ -843,11 +730,7 @@
                 <w:vertAlign w:val="baseline"/>
               </w:rPr>
             </w:pPr>
-            <w:r>
-              <w:rPr>
-                <w:rtl w:val="0"/>
-              </w:rPr>
-            </w:r>
+            <w:r/>
           </w:p>
         </w:tc>
       </w:tr>
@@ -881,13 +764,7 @@
               </w:rPr>
             </w:pPr>
             <w:r>
-              <w:rPr>
-                <w:b w:val="1"/>
-                <w:bCs w:val="1"/>
-                <w:color w:val="172b4d"/>
-                <w:rtl w:val="0"/>
-              </w:rPr>
-              <w:t xml:space="preserve">Phiên bản</w:t>
+              <w:t>Phiên bản</w:t>
             </w:r>
           </w:p>
         </w:tc>
@@ -911,10 +788,7 @@
               <w:rPr/>
             </w:pPr>
             <w:r>
-              <w:rPr>
-                <w:rtl w:val="0"/>
-              </w:rPr>
-              <w:t xml:space="preserve">0.1</w:t>
+              <w:t>0.1</w:t>
             </w:r>
           </w:p>
         </w:tc>
@@ -949,13 +823,7 @@
               </w:rPr>
             </w:pPr>
             <w:r>
-              <w:rPr>
-                <w:b w:val="1"/>
-                <w:bCs w:val="1"/>
-                <w:color w:val="172b4d"/>
-                <w:rtl w:val="0"/>
-              </w:rPr>
-              <w:t xml:space="preserve">Ngày phát hành</w:t>
+              <w:t>Ngày phát hành</w:t>
             </w:r>
           </w:p>
         </w:tc>
@@ -1007,11 +875,7 @@
                 <w:vertAlign w:val="baseline"/>
               </w:rPr>
             </w:pPr>
-            <w:r>
-              <w:rPr>
-                <w:rtl w:val="0"/>
-              </w:rPr>
-            </w:r>
+            <w:r/>
           </w:p>
         </w:tc>
       </w:tr>
@@ -1025,11 +889,7 @@
           <w:pgMar w:bottom="1134" w:top="1134" w:left="1701" w:right="992" w:header="720" w:footer="720"/>
         </w:sectPr>
       </w:pPr>
-      <w:r>
-        <w:rPr>
-          <w:rtl w:val="0"/>
-        </w:rPr>
-      </w:r>
+      <w:r/>
     </w:p>
     <w:p>
       <w:pPr>
@@ -1046,15 +906,7 @@
         </w:rPr>
       </w:pPr>
       <w:r>
-        <w:rPr>
-          <w:b w:val="1"/>
-          <w:bCs w:val="1"/>
-          <w:color w:val="000000"/>
-          <w:sz w:val="26"/>
-          <w:szCs w:val="26"/>
-          <w:rtl w:val="0"/>
-        </w:rPr>
-        <w:t xml:space="preserve">KIỂM SOÁT TÀI LIỆU</w:t>
+        <w:t>KIỂM SOÁT TÀI LIỆU</w:t>
       </w:r>
     </w:p>
     <w:p>
@@ -1072,16 +924,8 @@
         </w:rPr>
       </w:pPr>
       <w:r>
-        <w:rPr>
-          <w:b w:val="1"/>
-          <w:bCs w:val="1"/>
-          <w:color w:val="000000"/>
-          <w:sz w:val="26"/>
-          <w:szCs w:val="26"/>
-          <w:rtl w:val="0"/>
-        </w:rPr>
         <w:tab/>
-        <w:t xml:space="preserve">Thông tin kiểm soát</w:t>
+        <w:t>Thông tin kiểm soát</w:t>
       </w:r>
     </w:p>
     <w:p>
@@ -1098,11 +942,7 @@
           <w:szCs w:val="26"/>
         </w:rPr>
       </w:pPr>
-      <w:r>
-        <w:rPr>
-          <w:rtl w:val="0"/>
-        </w:rPr>
-      </w:r>
+      <w:r/>
     </w:p>
     <w:tbl>
       <w:tblPr>
@@ -1157,15 +997,7 @@
               </w:rPr>
             </w:pPr>
             <w:r>
-              <w:rPr>
-                <w:b w:val="1"/>
-                <w:bCs w:val="1"/>
-                <w:color w:val="000000"/>
-                <w:sz w:val="26"/>
-                <w:szCs w:val="26"/>
-                <w:rtl w:val="0"/>
-              </w:rPr>
-              <w:t xml:space="preserve">Ngày</w:t>
+              <w:t>Ngày</w:t>
             </w:r>
           </w:p>
         </w:tc>
@@ -1187,15 +1019,7 @@
               </w:rPr>
             </w:pPr>
             <w:r>
-              <w:rPr>
-                <w:b w:val="1"/>
-                <w:bCs w:val="1"/>
-                <w:color w:val="000000"/>
-                <w:sz w:val="26"/>
-                <w:szCs w:val="26"/>
-                <w:rtl w:val="0"/>
-              </w:rPr>
-              <w:t xml:space="preserve">Người lập</w:t>
+              <w:t>Người lập</w:t>
             </w:r>
           </w:p>
         </w:tc>
@@ -1217,15 +1041,7 @@
               </w:rPr>
             </w:pPr>
             <w:r>
-              <w:rPr>
-                <w:b w:val="1"/>
-                <w:bCs w:val="1"/>
-                <w:color w:val="000000"/>
-                <w:sz w:val="26"/>
-                <w:szCs w:val="26"/>
-                <w:rtl w:val="0"/>
-              </w:rPr>
-              <w:t xml:space="preserve">Người kiểm tra</w:t>
+              <w:t>Người kiểm tra</w:t>
             </w:r>
           </w:p>
           <w:p>
@@ -1244,15 +1060,7 @@
               </w:rPr>
             </w:pPr>
             <w:r>
-              <w:rPr>
-                <w:b w:val="1"/>
-                <w:bCs w:val="1"/>
-                <w:color w:val="000000"/>
-                <w:sz w:val="26"/>
-                <w:szCs w:val="26"/>
-                <w:rtl w:val="0"/>
-              </w:rPr>
-              <w:t xml:space="preserve">/ Kết quả</w:t>
+              <w:t>/ Kết quả</w:t>
             </w:r>
           </w:p>
         </w:tc>
@@ -1274,15 +1082,7 @@
               </w:rPr>
             </w:pPr>
             <w:r>
-              <w:rPr>
-                <w:b w:val="1"/>
-                <w:bCs w:val="1"/>
-                <w:color w:val="000000"/>
-                <w:sz w:val="26"/>
-                <w:szCs w:val="26"/>
-                <w:rtl w:val="0"/>
-              </w:rPr>
-              <w:t xml:space="preserve">Người phê duyệt</w:t>
+              <w:t>Người phê duyệt</w:t>
             </w:r>
           </w:p>
           <w:p>
@@ -1301,15 +1101,7 @@
               </w:rPr>
             </w:pPr>
             <w:r>
-              <w:rPr>
-                <w:b w:val="1"/>
-                <w:bCs w:val="1"/>
-                <w:color w:val="000000"/>
-                <w:sz w:val="26"/>
-                <w:szCs w:val="26"/>
-                <w:rtl w:val="0"/>
-              </w:rPr>
-              <w:t xml:space="preserve">/ Kết quả</w:t>
+              <w:t>/ Kết quả</w:t>
             </w:r>
           </w:p>
         </w:tc>
@@ -1336,15 +1128,7 @@
               </w:rPr>
             </w:pPr>
             <w:r>
-              <w:rPr>
-                <w:b w:val="1"/>
-                <w:bCs w:val="1"/>
-                <w:color w:val="000000"/>
-                <w:sz w:val="26"/>
-                <w:szCs w:val="26"/>
-                <w:rtl w:val="0"/>
-              </w:rPr>
-              <w:t xml:space="preserve">08/05/2020</w:t>
+              <w:t>08/05/2020</w:t>
             </w:r>
           </w:p>
         </w:tc>
@@ -1365,15 +1149,7 @@
               </w:rPr>
             </w:pPr>
             <w:r>
-              <w:rPr>
-                <w:b w:val="1"/>
-                <w:bCs w:val="1"/>
-                <w:color w:val="000000"/>
-                <w:sz w:val="26"/>
-                <w:szCs w:val="26"/>
-                <w:rtl w:val="0"/>
-              </w:rPr>
-              <w:t xml:space="preserve">Phạm Thị Hằng</w:t>
+              <w:t>Hồ Khánh Linh</w:t>
             </w:r>
           </w:p>
         </w:tc>
@@ -1392,11 +1168,7 @@
                 <w:szCs w:val="26"/>
               </w:rPr>
             </w:pPr>
-            <w:r>
-              <w:rPr>
-                <w:rtl w:val="0"/>
-              </w:rPr>
-            </w:r>
+            <w:r/>
           </w:p>
         </w:tc>
         <w:tc>
@@ -1415,11 +1187,7 @@
                 <w:szCs w:val="26"/>
               </w:rPr>
             </w:pPr>
-            <w:r>
-              <w:rPr>
-                <w:rtl w:val="0"/>
-              </w:rPr>
-            </w:r>
+            <w:r/>
           </w:p>
         </w:tc>
       </w:tr>
@@ -1444,11 +1212,7 @@
                 <w:szCs w:val="26"/>
               </w:rPr>
             </w:pPr>
-            <w:r>
-              <w:rPr>
-                <w:rtl w:val="0"/>
-              </w:rPr>
-            </w:r>
+            <w:r/>
           </w:p>
         </w:tc>
         <w:tc>
@@ -1467,11 +1231,7 @@
                 <w:szCs w:val="26"/>
               </w:rPr>
             </w:pPr>
-            <w:r>
-              <w:rPr>
-                <w:rtl w:val="0"/>
-              </w:rPr>
-            </w:r>
+            <w:r/>
           </w:p>
         </w:tc>
         <w:tc>
@@ -1488,11 +1248,7 @@
                 <w:szCs w:val="26"/>
               </w:rPr>
             </w:pPr>
-            <w:r>
-              <w:rPr>
-                <w:rtl w:val="0"/>
-              </w:rPr>
-            </w:r>
+            <w:r/>
           </w:p>
         </w:tc>
         <w:tc>
@@ -1511,11 +1267,7 @@
                 <w:szCs w:val="26"/>
               </w:rPr>
             </w:pPr>
-            <w:r>
-              <w:rPr>
-                <w:rtl w:val="0"/>
-              </w:rPr>
-            </w:r>
+            <w:r/>
           </w:p>
         </w:tc>
       </w:tr>
@@ -1534,11 +1286,7 @@
           <w:szCs w:val="26"/>
         </w:rPr>
       </w:pPr>
-      <w:r>
-        <w:rPr>
-          <w:rtl w:val="0"/>
-        </w:rPr>
-      </w:r>
+      <w:r/>
     </w:p>
     <w:p>
       <w:pPr>
@@ -1555,15 +1303,7 @@
         </w:rPr>
       </w:pPr>
       <w:r>
-        <w:rPr>
-          <w:b w:val="1"/>
-          <w:bCs w:val="1"/>
-          <w:color w:val="000000"/>
-          <w:sz w:val="26"/>
-          <w:szCs w:val="26"/>
-          <w:rtl w:val="0"/>
-        </w:rPr>
-        <w:t xml:space="preserve">Thông tin lịch sử</w:t>
+        <w:t>Thông tin lịch sử</w:t>
       </w:r>
     </w:p>
     <w:tbl>
@@ -1619,15 +1359,7 @@
               </w:rPr>
             </w:pPr>
             <w:r>
-              <w:rPr>
-                <w:b w:val="1"/>
-                <w:bCs w:val="1"/>
-                <w:color w:val="000000"/>
-                <w:sz w:val="26"/>
-                <w:szCs w:val="26"/>
-                <w:rtl w:val="0"/>
-              </w:rPr>
-              <w:t xml:space="preserve">Ngày</w:t>
+              <w:t>Ngày</w:t>
             </w:r>
           </w:p>
         </w:tc>
@@ -1649,15 +1381,7 @@
               </w:rPr>
             </w:pPr>
             <w:r>
-              <w:rPr>
-                <w:b w:val="1"/>
-                <w:bCs w:val="1"/>
-                <w:color w:val="000000"/>
-                <w:sz w:val="26"/>
-                <w:szCs w:val="26"/>
-                <w:rtl w:val="0"/>
-              </w:rPr>
-              <w:t xml:space="preserve">Người thực hiện</w:t>
+              <w:t>Người thực hiện</w:t>
             </w:r>
           </w:p>
         </w:tc>
@@ -1679,15 +1403,7 @@
               </w:rPr>
             </w:pPr>
             <w:r>
-              <w:rPr>
-                <w:b w:val="1"/>
-                <w:bCs w:val="1"/>
-                <w:color w:val="000000"/>
-                <w:sz w:val="26"/>
-                <w:szCs w:val="26"/>
-                <w:rtl w:val="0"/>
-              </w:rPr>
-              <w:t xml:space="preserve">Phiên bản</w:t>
+              <w:t>Phiên bản</w:t>
             </w:r>
           </w:p>
         </w:tc>
@@ -1709,15 +1425,7 @@
               </w:rPr>
             </w:pPr>
             <w:r>
-              <w:rPr>
-                <w:b w:val="1"/>
-                <w:bCs w:val="1"/>
-                <w:color w:val="000000"/>
-                <w:sz w:val="26"/>
-                <w:szCs w:val="26"/>
-                <w:rtl w:val="0"/>
-              </w:rPr>
-              <w:t xml:space="preserve">Nội dung</w:t>
+              <w:t>Nội dung</w:t>
             </w:r>
           </w:p>
         </w:tc>
@@ -1743,11 +1451,7 @@
                 <w:szCs w:val="26"/>
               </w:rPr>
             </w:pPr>
-            <w:r>
-              <w:rPr>
-                <w:rtl w:val="0"/>
-              </w:rPr>
-            </w:r>
+            <w:r/>
           </w:p>
         </w:tc>
         <w:tc>
@@ -1766,11 +1470,7 @@
                 <w:szCs w:val="26"/>
               </w:rPr>
             </w:pPr>
-            <w:r>
-              <w:rPr>
-                <w:rtl w:val="0"/>
-              </w:rPr>
-            </w:r>
+            <w:r/>
           </w:p>
         </w:tc>
         <w:tc>
@@ -1788,11 +1488,7 @@
                 <w:szCs w:val="26"/>
               </w:rPr>
             </w:pPr>
-            <w:r>
-              <w:rPr>
-                <w:rtl w:val="0"/>
-              </w:rPr>
-            </w:r>
+            <w:r/>
           </w:p>
         </w:tc>
         <w:tc>
@@ -1811,11 +1507,7 @@
                 <w:szCs w:val="26"/>
               </w:rPr>
             </w:pPr>
-            <w:r>
-              <w:rPr>
-                <w:rtl w:val="0"/>
-              </w:rPr>
-            </w:r>
+            <w:r/>
           </w:p>
         </w:tc>
       </w:tr>
@@ -1840,11 +1532,7 @@
                 <w:szCs w:val="26"/>
               </w:rPr>
             </w:pPr>
-            <w:r>
-              <w:rPr>
-                <w:rtl w:val="0"/>
-              </w:rPr>
-            </w:r>
+            <w:r/>
           </w:p>
         </w:tc>
         <w:tc>
@@ -1863,11 +1551,7 @@
                 <w:szCs w:val="26"/>
               </w:rPr>
             </w:pPr>
-            <w:r>
-              <w:rPr>
-                <w:rtl w:val="0"/>
-              </w:rPr>
-            </w:r>
+            <w:r/>
           </w:p>
         </w:tc>
         <w:tc>
@@ -1884,11 +1568,7 @@
                 <w:szCs w:val="26"/>
               </w:rPr>
             </w:pPr>
-            <w:r>
-              <w:rPr>
-                <w:rtl w:val="0"/>
-              </w:rPr>
-            </w:r>
+            <w:r/>
           </w:p>
         </w:tc>
         <w:tc>
@@ -1907,11 +1587,7 @@
                 <w:szCs w:val="26"/>
               </w:rPr>
             </w:pPr>
-            <w:r>
-              <w:rPr>
-                <w:rtl w:val="0"/>
-              </w:rPr>
-            </w:r>
+            <w:r/>
           </w:p>
         </w:tc>
       </w:tr>
@@ -1930,11 +1606,7 @@
           <w:szCs w:val="26"/>
         </w:rPr>
       </w:pPr>
-      <w:r>
-        <w:rPr>
-          <w:rtl w:val="0"/>
-        </w:rPr>
-      </w:r>
+      <w:r/>
     </w:p>
     <w:p>
       <w:pPr>
@@ -1951,15 +1623,7 @@
         </w:rPr>
       </w:pPr>
       <w:r>
-        <w:rPr>
-          <w:b w:val="1"/>
-          <w:bCs w:val="1"/>
-          <w:color w:val="000000"/>
-          <w:sz w:val="26"/>
-          <w:szCs w:val="26"/>
-          <w:rtl w:val="0"/>
-        </w:rPr>
-        <w:t xml:space="preserve">Tài liệu liên quan, tham khảo</w:t>
+        <w:t>Tài liệu liên quan, tham khảo</w:t>
       </w:r>
     </w:p>
     <w:tbl>
@@ -2013,15 +1677,7 @@
               </w:rPr>
             </w:pPr>
             <w:r>
-              <w:rPr>
-                <w:b w:val="1"/>
-                <w:bCs w:val="1"/>
-                <w:color w:val="000000"/>
-                <w:sz w:val="26"/>
-                <w:szCs w:val="26"/>
-                <w:rtl w:val="0"/>
-              </w:rPr>
-              <w:t xml:space="preserve">Ngày</w:t>
+              <w:t>Ngày</w:t>
             </w:r>
           </w:p>
         </w:tc>
@@ -2043,15 +1699,7 @@
               </w:rPr>
             </w:pPr>
             <w:r>
-              <w:rPr>
-                <w:b w:val="1"/>
-                <w:bCs w:val="1"/>
-                <w:color w:val="000000"/>
-                <w:sz w:val="26"/>
-                <w:szCs w:val="26"/>
-                <w:rtl w:val="0"/>
-              </w:rPr>
-              <w:t xml:space="preserve">Tên tài liệu</w:t>
+              <w:t>Tên tài liệu</w:t>
             </w:r>
           </w:p>
         </w:tc>
@@ -2073,15 +1721,7 @@
               </w:rPr>
             </w:pPr>
             <w:r>
-              <w:rPr>
-                <w:b w:val="1"/>
-                <w:bCs w:val="1"/>
-                <w:color w:val="000000"/>
-                <w:sz w:val="26"/>
-                <w:szCs w:val="26"/>
-                <w:rtl w:val="0"/>
-              </w:rPr>
-              <w:t xml:space="preserve">Nguồn</w:t>
+              <w:t>Nguồn</w:t>
             </w:r>
           </w:p>
         </w:tc>
@@ -2107,11 +1747,7 @@
                 <w:szCs w:val="26"/>
               </w:rPr>
             </w:pPr>
-            <w:r>
-              <w:rPr>
-                <w:rtl w:val="0"/>
-              </w:rPr>
-            </w:r>
+            <w:r/>
           </w:p>
         </w:tc>
         <w:tc>
@@ -2130,11 +1766,7 @@
                 <w:szCs w:val="26"/>
               </w:rPr>
             </w:pPr>
-            <w:r>
-              <w:rPr>
-                <w:rtl w:val="0"/>
-              </w:rPr>
-            </w:r>
+            <w:r/>
           </w:p>
         </w:tc>
         <w:tc>
@@ -2153,11 +1785,7 @@
                 <w:szCs w:val="26"/>
               </w:rPr>
             </w:pPr>
-            <w:r>
-              <w:rPr>
-                <w:rtl w:val="0"/>
-              </w:rPr>
-            </w:r>
+            <w:r/>
           </w:p>
         </w:tc>
       </w:tr>
@@ -2182,11 +1810,7 @@
                 <w:szCs w:val="26"/>
               </w:rPr>
             </w:pPr>
-            <w:r>
-              <w:rPr>
-                <w:rtl w:val="0"/>
-              </w:rPr>
-            </w:r>
+            <w:r/>
           </w:p>
         </w:tc>
         <w:tc>
@@ -2205,11 +1829,7 @@
                 <w:szCs w:val="26"/>
               </w:rPr>
             </w:pPr>
-            <w:r>
-              <w:rPr>
-                <w:rtl w:val="0"/>
-              </w:rPr>
-            </w:r>
+            <w:r/>
           </w:p>
         </w:tc>
         <w:tc>
@@ -2228,11 +1848,7 @@
                 <w:szCs w:val="26"/>
               </w:rPr>
             </w:pPr>
-            <w:r>
-              <w:rPr>
-                <w:rtl w:val="0"/>
-              </w:rPr>
-            </w:r>
+            <w:r/>
           </w:p>
         </w:tc>
       </w:tr>
@@ -2251,11 +1867,7 @@
           <w:szCs w:val="26"/>
         </w:rPr>
       </w:pPr>
-      <w:r>
-        <w:rPr>
-          <w:rtl w:val="0"/>
-        </w:rPr>
-      </w:r>
+      <w:r/>
     </w:p>
     <w:p>
       <w:pPr>
@@ -2271,11 +1883,7 @@
           <w:szCs w:val="26"/>
         </w:rPr>
       </w:pPr>
-      <w:r>
-        <w:rPr>
-          <w:rtl w:val="0"/>
-        </w:rPr>
-      </w:r>
+      <w:r/>
     </w:p>
     <w:p>
       <w:pPr>
@@ -2291,11 +1899,7 @@
           <w:szCs w:val="26"/>
         </w:rPr>
       </w:pPr>
-      <w:r>
-        <w:rPr>
-          <w:rtl w:val="0"/>
-        </w:rPr>
-      </w:r>
+      <w:r/>
     </w:p>
     <w:p>
       <w:pPr>
@@ -2311,11 +1915,7 @@
           <w:szCs w:val="26"/>
         </w:rPr>
       </w:pPr>
-      <w:r>
-        <w:rPr>
-          <w:rtl w:val="0"/>
-        </w:rPr>
-      </w:r>
+      <w:r/>
     </w:p>
     <w:p>
       <w:pPr>
@@ -2329,11 +1929,7 @@
           <w:szCs w:val="26"/>
         </w:rPr>
       </w:pPr>
-      <w:r>
-        <w:rPr>
-          <w:rtl w:val="0"/>
-        </w:rPr>
-      </w:r>
+      <w:r/>
     </w:p>
     <w:p>
       <w:pPr>
@@ -2349,14 +1945,7 @@
           <w:szCs w:val="26"/>
         </w:rPr>
       </w:pPr>
-      <w:r>
-        <w:br w:type="page"/>
-      </w:r>
-      <w:r>
-        <w:rPr>
-          <w:rtl w:val="0"/>
-        </w:rPr>
-      </w:r>
+      <w:r/>
     </w:p>
     <w:p>
       <w:pPr>
@@ -2378,10 +1967,7 @@
         <w:rPr/>
       </w:pPr>
       <w:r>
-        <w:rPr>
-          <w:rtl w:val="0"/>
-        </w:rPr>
-        <w:t xml:space="preserve">MỤC LỤC</w:t>
+        <w:t>MỤC LỤC</w:t>
       </w:r>
     </w:p>
     <w:sdt>
@@ -3994,27 +3580,15 @@
           <w:szCs w:val="26"/>
         </w:rPr>
       </w:pPr>
-      <w:r>
-        <w:br w:type="page"/>
-      </w:r>
-      <w:r>
-        <w:rPr>
-          <w:rtl w:val="0"/>
-        </w:rPr>
-      </w:r>
+      <w:r/>
     </w:p>
     <w:p>
       <w:pPr>
         <w:pStyle w:val="Heading1"/>
         <w:rPr/>
       </w:pPr>
-      <w:bookmarkStart w:colFirst="0" w:colLast="0" w:name="_heading=h.u9a1iwq10nq" w:id="1"/>
-      <w:bookmarkEnd w:id="1"/>
-      <w:r>
-        <w:rPr>
-          <w:rtl w:val="0"/>
-        </w:rPr>
-        <w:t xml:space="preserve">PHẦN 1: GIỚI THIỆU</w:t>
+      <w:r>
+        <w:t>PHẦN 1: GIỚI THIỆU</w:t>
       </w:r>
     </w:p>
     <w:p>
@@ -4026,11 +3600,7 @@
         <w:spacing w:line="360" w:lineRule="auto"/>
         <w:rPr/>
       </w:pPr>
-      <w:r>
-        <w:rPr>
-          <w:rtl w:val="0"/>
-        </w:rPr>
-      </w:r>
+      <w:r/>
     </w:p>
     <w:p>
       <w:pPr>
@@ -4041,13 +3611,8 @@
         <w:spacing w:line="360" w:lineRule="auto"/>
         <w:rPr/>
       </w:pPr>
-      <w:bookmarkStart w:colFirst="0" w:colLast="0" w:name="_heading=h.i56jttj6n076" w:id="2"/>
-      <w:bookmarkEnd w:id="2"/>
-      <w:r>
-        <w:rPr>
-          <w:rtl w:val="0"/>
-        </w:rPr>
-        <w:t xml:space="preserve">1.1 Mục đích tài liệu</w:t>
+      <w:r>
+        <w:t>1.1 Mục đích tài liệu</w:t>
       </w:r>
     </w:p>
     <w:p>
@@ -4073,11 +3638,7 @@
           <w:szCs w:val="26"/>
         </w:rPr>
       </w:pPr>
-      <w:r>
-        <w:rPr>
-          <w:rtl w:val="0"/>
-        </w:rPr>
-      </w:r>
+      <w:r/>
     </w:p>
     <w:p>
       <w:pPr>
@@ -4092,11 +3653,7 @@
           <w:szCs w:val="26"/>
         </w:rPr>
       </w:pPr>
-      <w:r>
-        <w:rPr>
-          <w:rtl w:val="0"/>
-        </w:rPr>
-      </w:r>
+      <w:r/>
     </w:p>
     <w:p>
       <w:pPr>
@@ -4107,13 +3664,8 @@
         <w:spacing w:line="360" w:lineRule="auto"/>
         <w:rPr/>
       </w:pPr>
-      <w:bookmarkStart w:colFirst="0" w:colLast="0" w:name="_heading=h.2wo17v668okq" w:id="3"/>
-      <w:bookmarkEnd w:id="3"/>
-      <w:r>
-        <w:rPr>
-          <w:rtl w:val="0"/>
-        </w:rPr>
-        <w:t xml:space="preserve">1.2 Phạm vi tài liệu</w:t>
+      <w:r>
+        <w:t>1.2 Phạm vi tài liệu</w:t>
       </w:r>
     </w:p>
     <w:p>
@@ -4140,11 +3692,7 @@
           <w:szCs w:val="26"/>
         </w:rPr>
       </w:pPr>
-      <w:r>
-        <w:rPr>
-          <w:rtl w:val="0"/>
-        </w:rPr>
-      </w:r>
+      <w:r/>
     </w:p>
     <w:p>
       <w:pPr>
@@ -4160,11 +3708,7 @@
           <w:szCs w:val="26"/>
         </w:rPr>
       </w:pPr>
-      <w:r>
-        <w:rPr>
-          <w:rtl w:val="0"/>
-        </w:rPr>
-      </w:r>
+      <w:r/>
     </w:p>
     <w:p>
       <w:pPr>
@@ -4180,13 +3724,8 @@
         <w:ind w:left="360" w:hanging="360"/>
         <w:rPr/>
       </w:pPr>
-      <w:bookmarkStart w:colFirst="0" w:colLast="0" w:name="_heading=h.m681nn2psryq" w:id="4"/>
-      <w:bookmarkEnd w:id="4"/>
-      <w:r>
-        <w:rPr>
-          <w:rtl w:val="0"/>
-        </w:rPr>
-        <w:t xml:space="preserve">Tổng quan ứng dụng</w:t>
+      <w:r>
+        <w:t>Tổng quan ứng dụng</w:t>
       </w:r>
     </w:p>
     <w:p>
@@ -4213,11 +3752,7 @@
           <w:szCs w:val="26"/>
         </w:rPr>
       </w:pPr>
-      <w:r>
-        <w:rPr>
-          <w:rtl w:val="0"/>
-        </w:rPr>
-      </w:r>
+      <w:r/>
     </w:p>
     <w:p>
       <w:pPr>
@@ -4233,11 +3768,7 @@
           <w:szCs w:val="26"/>
         </w:rPr>
       </w:pPr>
-      <w:r>
-        <w:rPr>
-          <w:rtl w:val="0"/>
-        </w:rPr>
-      </w:r>
+      <w:r/>
     </w:p>
     <w:p>
       <w:pPr>
@@ -4248,13 +3779,8 @@
         <w:spacing w:line="360" w:lineRule="auto"/>
         <w:rPr/>
       </w:pPr>
-      <w:bookmarkStart w:colFirst="0" w:colLast="0" w:name="_heading=h.nkx6yuseecf3" w:id="5"/>
-      <w:bookmarkEnd w:id="5"/>
-      <w:r>
-        <w:rPr>
-          <w:rtl w:val="0"/>
-        </w:rPr>
-        <w:t xml:space="preserve">1.4 Thuật ngữ viết tắt</w:t>
+      <w:r>
+        <w:t>1.4 Thuật ngữ viết tắt</w:t>
       </w:r>
     </w:p>
     <w:tbl>
@@ -4308,15 +3834,28 @@
               </w:rPr>
             </w:pPr>
             <w:r>
+              <w:t>STT</w:t>
+            </w:r>
+          </w:p>
+        </w:tc>
+        <w:tc>
+          <w:tcPr>
+            <w:vAlign w:val="center"/>
+          </w:tcPr>
+          <w:p>
+            <w:pPr>
+              <w:spacing w:line="360" w:lineRule="auto"/>
+              <w:jc w:val="center"/>
               <w:rPr>
                 <w:b w:val="1"/>
                 <w:bCs w:val="1"/>
                 <w:color w:val="000000"/>
                 <w:sz w:val="26"/>
                 <w:szCs w:val="26"/>
-                <w:rtl w:val="0"/>
-              </w:rPr>
-              <w:t xml:space="preserve">STT</w:t>
+              </w:rPr>
+            </w:pPr>
+            <w:r>
+              <w:t>Từ viết tắt</w:t>
             </w:r>
           </w:p>
         </w:tc>
@@ -4337,44 +3876,7 @@
               </w:rPr>
             </w:pPr>
             <w:r>
-              <w:rPr>
-                <w:b w:val="1"/>
-                <w:bCs w:val="1"/>
-                <w:color w:val="000000"/>
-                <w:sz w:val="26"/>
-                <w:szCs w:val="26"/>
-                <w:rtl w:val="0"/>
-              </w:rPr>
-              <w:t xml:space="preserve">Từ viết tắt</w:t>
-            </w:r>
-          </w:p>
-        </w:tc>
-        <w:tc>
-          <w:tcPr>
-            <w:vAlign w:val="center"/>
-          </w:tcPr>
-          <w:p>
-            <w:pPr>
-              <w:spacing w:line="360" w:lineRule="auto"/>
-              <w:jc w:val="center"/>
-              <w:rPr>
-                <w:b w:val="1"/>
-                <w:bCs w:val="1"/>
-                <w:color w:val="000000"/>
-                <w:sz w:val="26"/>
-                <w:szCs w:val="26"/>
-              </w:rPr>
-            </w:pPr>
-            <w:r>
-              <w:rPr>
-                <w:b w:val="1"/>
-                <w:bCs w:val="1"/>
-                <w:color w:val="000000"/>
-                <w:sz w:val="26"/>
-                <w:szCs w:val="26"/>
-                <w:rtl w:val="0"/>
-              </w:rPr>
-              <w:t xml:space="preserve">Diễn giải</w:t>
+              <w:t>Diễn giải</w:t>
             </w:r>
           </w:p>
         </w:tc>
@@ -4400,13 +3902,26 @@
               </w:rPr>
             </w:pPr>
             <w:r>
+              <w:t>1</w:t>
+            </w:r>
+          </w:p>
+        </w:tc>
+        <w:tc>
+          <w:tcPr>
+            <w:vAlign w:val="center"/>
+          </w:tcPr>
+          <w:p>
+            <w:pPr>
+              <w:spacing w:line="360" w:lineRule="auto"/>
+              <w:jc w:val="left"/>
               <w:rPr>
                 <w:color w:val="000000"/>
                 <w:sz w:val="26"/>
                 <w:szCs w:val="26"/>
-                <w:rtl w:val="0"/>
-              </w:rPr>
-              <w:t xml:space="preserve">1</w:t>
+              </w:rPr>
+            </w:pPr>
+            <w:r>
+              <w:t>OTA</w:t>
             </w:r>
           </w:p>
         </w:tc>
@@ -4425,38 +3940,7 @@
               </w:rPr>
             </w:pPr>
             <w:r>
-              <w:rPr>
-                <w:color w:val="000000"/>
-                <w:sz w:val="26"/>
-                <w:szCs w:val="26"/>
-                <w:rtl w:val="0"/>
-              </w:rPr>
-              <w:t xml:space="preserve">OTA</w:t>
-            </w:r>
-          </w:p>
-        </w:tc>
-        <w:tc>
-          <w:tcPr>
-            <w:vAlign w:val="center"/>
-          </w:tcPr>
-          <w:p>
-            <w:pPr>
-              <w:spacing w:line="360" w:lineRule="auto"/>
-              <w:jc w:val="left"/>
-              <w:rPr>
-                <w:color w:val="000000"/>
-                <w:sz w:val="26"/>
-                <w:szCs w:val="26"/>
-              </w:rPr>
-            </w:pPr>
-            <w:r>
-              <w:rPr>
-                <w:color w:val="000000"/>
-                <w:sz w:val="26"/>
-                <w:szCs w:val="26"/>
-                <w:rtl w:val="0"/>
-              </w:rPr>
-              <w:t xml:space="preserve">Online Travel Agency</w:t>
+              <w:t>Online Travel Agency</w:t>
             </w:r>
           </w:p>
         </w:tc>
@@ -4482,13 +3966,26 @@
               </w:rPr>
             </w:pPr>
             <w:r>
+              <w:t>2</w:t>
+            </w:r>
+          </w:p>
+        </w:tc>
+        <w:tc>
+          <w:tcPr>
+            <w:vAlign w:val="center"/>
+          </w:tcPr>
+          <w:p>
+            <w:pPr>
+              <w:spacing w:line="360" w:lineRule="auto"/>
+              <w:jc w:val="left"/>
               <w:rPr>
                 <w:color w:val="000000"/>
                 <w:sz w:val="26"/>
                 <w:szCs w:val="26"/>
-                <w:rtl w:val="0"/>
-              </w:rPr>
-              <w:t xml:space="preserve">2</w:t>
+              </w:rPr>
+            </w:pPr>
+            <w:r>
+              <w:t>PMS</w:t>
             </w:r>
           </w:p>
         </w:tc>
@@ -4507,38 +4004,7 @@
               </w:rPr>
             </w:pPr>
             <w:r>
-              <w:rPr>
-                <w:color w:val="000000"/>
-                <w:sz w:val="26"/>
-                <w:szCs w:val="26"/>
-                <w:rtl w:val="0"/>
-              </w:rPr>
-              <w:t xml:space="preserve">PMS</w:t>
-            </w:r>
-          </w:p>
-        </w:tc>
-        <w:tc>
-          <w:tcPr>
-            <w:vAlign w:val="center"/>
-          </w:tcPr>
-          <w:p>
-            <w:pPr>
-              <w:spacing w:line="360" w:lineRule="auto"/>
-              <w:jc w:val="left"/>
-              <w:rPr>
-                <w:color w:val="000000"/>
-                <w:sz w:val="26"/>
-                <w:szCs w:val="26"/>
-              </w:rPr>
-            </w:pPr>
-            <w:r>
-              <w:rPr>
-                <w:color w:val="000000"/>
-                <w:sz w:val="26"/>
-                <w:szCs w:val="26"/>
-                <w:rtl w:val="0"/>
-              </w:rPr>
-              <w:t xml:space="preserve">Property Managmement System</w:t>
+              <w:t>Property Managmement System</w:t>
             </w:r>
           </w:p>
         </w:tc>
@@ -4564,13 +4030,26 @@
               </w:rPr>
             </w:pPr>
             <w:r>
+              <w:t>3</w:t>
+            </w:r>
+          </w:p>
+        </w:tc>
+        <w:tc>
+          <w:tcPr>
+            <w:vAlign w:val="center"/>
+          </w:tcPr>
+          <w:p>
+            <w:pPr>
+              <w:spacing w:line="360" w:lineRule="auto"/>
+              <w:jc w:val="left"/>
               <w:rPr>
                 <w:color w:val="000000"/>
                 <w:sz w:val="26"/>
                 <w:szCs w:val="26"/>
-                <w:rtl w:val="0"/>
-              </w:rPr>
-              <w:t xml:space="preserve">3</w:t>
+              </w:rPr>
+            </w:pPr>
+            <w:r>
+              <w:t>ID</w:t>
             </w:r>
           </w:p>
         </w:tc>
@@ -4589,37 +4068,6 @@
               </w:rPr>
             </w:pPr>
             <w:r>
-              <w:rPr>
-                <w:color w:val="000000"/>
-                <w:sz w:val="26"/>
-                <w:szCs w:val="26"/>
-                <w:rtl w:val="0"/>
-              </w:rPr>
-              <w:t xml:space="preserve">ID</w:t>
-            </w:r>
-          </w:p>
-        </w:tc>
-        <w:tc>
-          <w:tcPr>
-            <w:vAlign w:val="center"/>
-          </w:tcPr>
-          <w:p>
-            <w:pPr>
-              <w:spacing w:line="360" w:lineRule="auto"/>
-              <w:jc w:val="left"/>
-              <w:rPr>
-                <w:color w:val="000000"/>
-                <w:sz w:val="26"/>
-                <w:szCs w:val="26"/>
-              </w:rPr>
-            </w:pPr>
-            <w:r>
-              <w:rPr>
-                <w:color w:val="000000"/>
-                <w:sz w:val="26"/>
-                <w:szCs w:val="26"/>
-                <w:rtl w:val="0"/>
-              </w:rPr>
               <w:t xml:space="preserve">Mã </w:t>
             </w:r>
           </w:p>
@@ -4646,13 +4094,26 @@
               </w:rPr>
             </w:pPr>
             <w:r>
+              <w:t>4</w:t>
+            </w:r>
+          </w:p>
+        </w:tc>
+        <w:tc>
+          <w:tcPr>
+            <w:vAlign w:val="center"/>
+          </w:tcPr>
+          <w:p>
+            <w:pPr>
+              <w:spacing w:line="360" w:lineRule="auto"/>
+              <w:jc w:val="left"/>
               <w:rPr>
                 <w:color w:val="000000"/>
                 <w:sz w:val="26"/>
                 <w:szCs w:val="26"/>
-                <w:rtl w:val="0"/>
-              </w:rPr>
-              <w:t xml:space="preserve">4</w:t>
+              </w:rPr>
+            </w:pPr>
+            <w:r>
+              <w:t>UUID</w:t>
             </w:r>
           </w:p>
         </w:tc>
@@ -4671,37 +4132,6 @@
               </w:rPr>
             </w:pPr>
             <w:r>
-              <w:rPr>
-                <w:color w:val="000000"/>
-                <w:sz w:val="26"/>
-                <w:szCs w:val="26"/>
-                <w:rtl w:val="0"/>
-              </w:rPr>
-              <w:t xml:space="preserve">UUID</w:t>
-            </w:r>
-          </w:p>
-        </w:tc>
-        <w:tc>
-          <w:tcPr>
-            <w:vAlign w:val="center"/>
-          </w:tcPr>
-          <w:p>
-            <w:pPr>
-              <w:spacing w:line="360" w:lineRule="auto"/>
-              <w:jc w:val="left"/>
-              <w:rPr>
-                <w:color w:val="000000"/>
-                <w:sz w:val="26"/>
-                <w:szCs w:val="26"/>
-              </w:rPr>
-            </w:pPr>
-            <w:r>
-              <w:rPr>
-                <w:color w:val="000000"/>
-                <w:sz w:val="26"/>
-                <w:szCs w:val="26"/>
-                <w:rtl w:val="0"/>
-              </w:rPr>
               <w:t xml:space="preserve">Universally Unique Indentifier </w:t>
             </w:r>
           </w:p>
@@ -4728,13 +4158,26 @@
               </w:rPr>
             </w:pPr>
             <w:r>
+              <w:t>5</w:t>
+            </w:r>
+          </w:p>
+        </w:tc>
+        <w:tc>
+          <w:tcPr>
+            <w:vAlign w:val="center"/>
+          </w:tcPr>
+          <w:p>
+            <w:pPr>
+              <w:spacing w:line="360" w:lineRule="auto"/>
+              <w:jc w:val="left"/>
               <w:rPr>
                 <w:color w:val="000000"/>
                 <w:sz w:val="26"/>
                 <w:szCs w:val="26"/>
-                <w:rtl w:val="0"/>
-              </w:rPr>
-              <w:t xml:space="preserve">5</w:t>
+              </w:rPr>
+            </w:pPr>
+            <w:r>
+              <w:t>OTA GW</w:t>
             </w:r>
           </w:p>
         </w:tc>
@@ -4753,38 +4196,7 @@
               </w:rPr>
             </w:pPr>
             <w:r>
-              <w:rPr>
-                <w:color w:val="000000"/>
-                <w:sz w:val="26"/>
-                <w:szCs w:val="26"/>
-                <w:rtl w:val="0"/>
-              </w:rPr>
-              <w:t xml:space="preserve">OTA GW</w:t>
-            </w:r>
-          </w:p>
-        </w:tc>
-        <w:tc>
-          <w:tcPr>
-            <w:vAlign w:val="center"/>
-          </w:tcPr>
-          <w:p>
-            <w:pPr>
-              <w:spacing w:line="360" w:lineRule="auto"/>
-              <w:jc w:val="left"/>
-              <w:rPr>
-                <w:color w:val="000000"/>
-                <w:sz w:val="26"/>
-                <w:szCs w:val="26"/>
-              </w:rPr>
-            </w:pPr>
-            <w:r>
-              <w:rPr>
-                <w:color w:val="000000"/>
-                <w:sz w:val="26"/>
-                <w:szCs w:val="26"/>
-                <w:rtl w:val="0"/>
-              </w:rPr>
-              <w:t xml:space="preserve">OTA Gateway</w:t>
+              <w:t>OTA Gateway</w:t>
             </w:r>
           </w:p>
         </w:tc>
@@ -4810,13 +4222,7 @@
               </w:rPr>
             </w:pPr>
             <w:r>
-              <w:rPr>
-                <w:color w:val="000000"/>
-                <w:sz w:val="26"/>
-                <w:szCs w:val="26"/>
-                <w:rtl w:val="0"/>
-              </w:rPr>
-              <w:t xml:space="preserve">6</w:t>
+              <w:t>6</w:t>
             </w:r>
           </w:p>
         </w:tc>
@@ -4836,38 +4242,26 @@
               </w:rPr>
             </w:pPr>
             <w:r>
+              <w:t>STT</w:t>
+            </w:r>
+          </w:p>
+        </w:tc>
+        <w:tc>
+          <w:tcPr>
+            <w:vAlign w:val="center"/>
+          </w:tcPr>
+          <w:p>
+            <w:pPr>
+              <w:spacing w:line="360" w:lineRule="auto"/>
+              <w:jc w:val="left"/>
               <w:rPr>
                 <w:color w:val="000000"/>
                 <w:sz w:val="26"/>
                 <w:szCs w:val="26"/>
-                <w:rtl w:val="0"/>
-              </w:rPr>
-              <w:t xml:space="preserve">STT</w:t>
-            </w:r>
-          </w:p>
-        </w:tc>
-        <w:tc>
-          <w:tcPr>
-            <w:vAlign w:val="center"/>
-          </w:tcPr>
-          <w:p>
-            <w:pPr>
-              <w:spacing w:line="360" w:lineRule="auto"/>
-              <w:jc w:val="left"/>
-              <w:rPr>
-                <w:color w:val="000000"/>
-                <w:sz w:val="26"/>
-                <w:szCs w:val="26"/>
-              </w:rPr>
-            </w:pPr>
-            <w:r>
-              <w:rPr>
-                <w:color w:val="000000"/>
-                <w:sz w:val="26"/>
-                <w:szCs w:val="26"/>
-                <w:rtl w:val="0"/>
-              </w:rPr>
-              <w:t xml:space="preserve">Số thứ tự</w:t>
+              </w:rPr>
+            </w:pPr>
+            <w:r>
+              <w:t>Số thứ tự</w:t>
             </w:r>
           </w:p>
         </w:tc>
@@ -4916,31 +4310,15 @@
           <w:pgMar w:bottom="1134" w:top="1134" w:left="1701" w:right="992" w:header="720" w:footer="720"/>
         </w:sectPr>
       </w:pPr>
-      <w:r>
-        <w:rPr>
-          <w:rtl w:val="0"/>
-        </w:rPr>
-      </w:r>
+      <w:r/>
     </w:p>
     <w:p>
       <w:pPr>
         <w:pStyle w:val="Heading1"/>
         <w:rPr/>
       </w:pPr>
-      <w:bookmarkStart w:colFirst="0" w:colLast="0" w:name="_heading=h.71db18exaasn" w:id="6"/>
-      <w:bookmarkEnd w:id="6"/>
-      <w:r>
-        <w:rPr>
-          <w:b w:val="1"/>
-          <w:bCs w:val="1"/>
-          <w:rtl w:val="0"/>
-        </w:rPr>
-        <w:t xml:space="preserve">PHẦN 2: YÊU CẦU TỔNG THỂ</w:t>
-      </w:r>
-      <w:r>
-        <w:rPr>
-          <w:rtl w:val="0"/>
-        </w:rPr>
+      <w:r>
+        <w:t>PHẦN 2: YÊU CẦU TỔNG THỂ</w:t>
       </w:r>
     </w:p>
     <w:p>
@@ -4948,13 +4326,8 @@
         <w:pStyle w:val="Heading2"/>
         <w:rPr/>
       </w:pPr>
-      <w:bookmarkStart w:colFirst="0" w:colLast="0" w:name="_heading=h.j8glbgq1ehp5" w:id="7"/>
-      <w:bookmarkEnd w:id="7"/>
-      <w:r>
-        <w:rPr>
-          <w:rtl w:val="0"/>
-        </w:rPr>
-        <w:t xml:space="preserve">2.1 Sơ đồ quan hệ đối tượng</w:t>
+      <w:r>
+        <w:t>2.1 Sơ đồ quan hệ đối tượng</w:t>
       </w:r>
     </w:p>
     <w:p>
@@ -4996,24 +4369,15 @@
       <w:pPr>
         <w:rPr/>
       </w:pPr>
-      <w:r>
-        <w:rPr>
-          <w:rtl w:val="0"/>
-        </w:rPr>
-      </w:r>
+      <w:r/>
     </w:p>
     <w:p>
       <w:pPr>
         <w:pStyle w:val="Heading2"/>
         <w:rPr/>
       </w:pPr>
-      <w:bookmarkStart w:colFirst="0" w:colLast="0" w:name="_heading=h.pizikf4gx6v8" w:id="8"/>
-      <w:bookmarkEnd w:id="8"/>
-      <w:r>
-        <w:rPr>
-          <w:rtl w:val="0"/>
-        </w:rPr>
-        <w:t xml:space="preserve">2.2 Sơ đồ Use Case</w:t>
+      <w:r>
+        <w:t>2.2 Sơ đồ Use Case</w:t>
       </w:r>
     </w:p>
     <w:p>
@@ -5035,24 +4399,15 @@
       <w:pPr>
         <w:rPr/>
       </w:pPr>
-      <w:r>
-        <w:rPr>
-          <w:rtl w:val="0"/>
-        </w:rPr>
-      </w:r>
+      <w:r/>
     </w:p>
     <w:p>
       <w:pPr>
         <w:pStyle w:val="Heading2"/>
         <w:rPr/>
       </w:pPr>
-      <w:bookmarkStart w:colFirst="0" w:colLast="0" w:name="_heading=h.3bhv4rzbyws9" w:id="9"/>
-      <w:bookmarkEnd w:id="9"/>
-      <w:r>
-        <w:rPr>
-          <w:rtl w:val="0"/>
-        </w:rPr>
-        <w:t xml:space="preserve">2.3 Sơ đồ luồng</w:t>
+      <w:r>
+        <w:t>2.3 Sơ đồ luồng</w:t>
       </w:r>
     </w:p>
     <w:p>
@@ -5070,24 +4425,15 @@
         <w:pStyle w:val="Heading2"/>
         <w:rPr/>
       </w:pPr>
-      <w:r>
-        <w:rPr>
-          <w:rtl w:val="0"/>
-        </w:rPr>
-      </w:r>
+      <w:r/>
     </w:p>
     <w:p>
       <w:pPr>
         <w:pStyle w:val="Heading2"/>
         <w:rPr/>
       </w:pPr>
-      <w:bookmarkStart w:colFirst="0" w:colLast="0" w:name="_heading=h.l0yi51u9bbzm" w:id="10"/>
-      <w:bookmarkEnd w:id="10"/>
-      <w:r>
-        <w:rPr>
-          <w:rtl w:val="0"/>
-        </w:rPr>
-        <w:t xml:space="preserve">2.4. Sơ đồ chuyển trạng thái</w:t>
+      <w:r>
+        <w:t>2.4. Sơ đồ chuyển trạng thái</w:t>
       </w:r>
     </w:p>
     <w:p>
@@ -5115,24 +4461,15 @@
         <w:pStyle w:val="Heading2"/>
         <w:rPr/>
       </w:pPr>
-      <w:r>
-        <w:rPr>
-          <w:rtl w:val="0"/>
-        </w:rPr>
-      </w:r>
+      <w:r/>
     </w:p>
     <w:p>
       <w:pPr>
         <w:pStyle w:val="Heading2"/>
         <w:rPr/>
       </w:pPr>
-      <w:bookmarkStart w:colFirst="0" w:colLast="0" w:name="_heading=h.u1idk8guddtt" w:id="11"/>
-      <w:bookmarkEnd w:id="11"/>
-      <w:r>
-        <w:rPr>
-          <w:rtl w:val="0"/>
-        </w:rPr>
-        <w:t xml:space="preserve">2.5. Phân quyền</w:t>
+      <w:r>
+        <w:t>2.5. Phân quyền</w:t>
       </w:r>
     </w:p>
     <w:p>
@@ -5140,13 +4477,8 @@
         <w:pStyle w:val="Heading3"/>
         <w:rPr/>
       </w:pPr>
-      <w:bookmarkStart w:colFirst="0" w:colLast="0" w:name="_heading=h.102eapa6kjzq" w:id="12"/>
-      <w:bookmarkEnd w:id="12"/>
-      <w:r>
-        <w:rPr>
-          <w:rtl w:val="0"/>
-        </w:rPr>
-        <w:t xml:space="preserve">2.5.1. Phân quyền chức năng</w:t>
+      <w:r>
+        <w:t>2.5.1. Phân quyền chức năng</w:t>
       </w:r>
     </w:p>
     <w:p>
@@ -5163,24 +4495,15 @@
       <w:pPr>
         <w:rPr/>
       </w:pPr>
-      <w:r>
-        <w:rPr>
-          <w:rtl w:val="0"/>
-        </w:rPr>
-      </w:r>
+      <w:r/>
     </w:p>
     <w:p>
       <w:pPr>
         <w:pStyle w:val="Heading3"/>
         <w:rPr/>
       </w:pPr>
-      <w:bookmarkStart w:colFirst="0" w:colLast="0" w:name="_heading=h.wgqzleh5lnsp" w:id="13"/>
-      <w:bookmarkEnd w:id="13"/>
-      <w:r>
-        <w:rPr>
-          <w:rtl w:val="0"/>
-        </w:rPr>
-        <w:t xml:space="preserve">2.5.2. Phân quyền dữ liệu</w:t>
+      <w:r>
+        <w:t>2.5.2. Phân quyền dữ liệu</w:t>
       </w:r>
     </w:p>
     <w:p>
@@ -5198,24 +4521,15 @@
         <w:pStyle w:val="Heading2"/>
         <w:rPr/>
       </w:pPr>
-      <w:r>
-        <w:rPr>
-          <w:rtl w:val="0"/>
-        </w:rPr>
-      </w:r>
+      <w:r/>
     </w:p>
     <w:p>
       <w:pPr>
         <w:pStyle w:val="Heading2"/>
         <w:rPr/>
       </w:pPr>
-      <w:bookmarkStart w:colFirst="0" w:colLast="0" w:name="_heading=h.gdrf2uetebv" w:id="14"/>
-      <w:bookmarkEnd w:id="14"/>
-      <w:r>
-        <w:rPr>
-          <w:rtl w:val="0"/>
-        </w:rPr>
-        <w:t xml:space="preserve">2.6. Site Map</w:t>
+      <w:r>
+        <w:t>2.6. Site Map</w:t>
       </w:r>
     </w:p>
     <w:p>
@@ -5262,11 +4576,7 @@
           <w:pgMar w:bottom="1134" w:top="1134" w:left="1701" w:right="992" w:header="720" w:footer="720"/>
         </w:sectPr>
       </w:pPr>
-      <w:r>
-        <w:rPr>
-          <w:rtl w:val="0"/>
-        </w:rPr>
-      </w:r>
+      <w:r/>
     </w:p>
     <w:p>
       <w:pPr>
@@ -5276,26 +4586,15 @@
           <w:bCs w:val="1"/>
         </w:rPr>
       </w:pPr>
-      <w:bookmarkStart w:colFirst="0" w:colLast="0" w:name="_heading=h.u0fx9gn4uajw" w:id="15"/>
-      <w:bookmarkEnd w:id="15"/>
-      <w:r>
-        <w:rPr>
-          <w:b w:val="1"/>
-          <w:bCs w:val="1"/>
-          <w:rtl w:val="0"/>
-        </w:rPr>
-        <w:t xml:space="preserve">PHẦN 3: CHỨC NĂNG</w:t>
+      <w:r>
+        <w:t>PHẦN 3: CHỨC NĂNG</w:t>
       </w:r>
     </w:p>
     <w:p>
       <w:pPr>
         <w:rPr/>
       </w:pPr>
-      <w:r>
-        <w:rPr>
-          <w:rtl w:val="0"/>
-        </w:rPr>
-      </w:r>
+      <w:r/>
     </w:p>
     <w:p>
       <w:pPr>
@@ -5331,28 +4630,7 @@
         </w:rPr>
       </w:pPr>
       <w:r>
-        <w:rPr>
-          <w:rFonts w:ascii="Times New Roman" w:cs="Times New Roman" w:eastAsia="Times New Roman" w:hAnsi="Times New Roman"/>
-          <w:b w:val="0"/>
-          <w:bCs w:val="0"/>
-          <w:i w:val="1"/>
-          <w:iCs w:val="1"/>
-          <w:smallCaps w:val="0"/>
-          <w:strike w:val="0"/>
-          <w:color w:val="172b4d"/>
-          <w:sz w:val="24"/>
-          <w:szCs w:val="24"/>
-          <w:u w:val="none"/>
-          <w:shd w:fill="auto" w:val="clear"/>
-          <w:vertAlign w:val="baseline"/>
-          <w:rtl w:val="0"/>
-        </w:rPr>
-        <w:t xml:space="preserve">[Danh sách chức năng và đặc tả chi tiết từng chức năng]</w:t>
-      </w:r>
-      <w:r>
-        <w:rPr>
-          <w:rtl w:val="0"/>
-        </w:rPr>
+        <w:t>[Danh sách chức năng và đặc tả chi tiết từng chức năng]</w:t>
       </w:r>
     </w:p>
     <w:tbl>
@@ -5409,11 +4687,7 @@
                 <w:color w:val="172b4d"/>
               </w:rPr>
             </w:pPr>
-            <w:r>
-              <w:rPr>
-                <w:rtl w:val="0"/>
-              </w:rPr>
-            </w:r>
+            <w:r/>
           </w:p>
         </w:tc>
         <w:tc>
@@ -5442,13 +4716,7 @@
               </w:rPr>
             </w:pPr>
             <w:r>
-              <w:rPr>
-                <w:b w:val="1"/>
-                <w:bCs w:val="1"/>
-                <w:color w:val="172b4d"/>
-                <w:rtl w:val="0"/>
-              </w:rPr>
-              <w:t xml:space="preserve">Mã</w:t>
+              <w:t>Mã</w:t>
             </w:r>
           </w:p>
         </w:tc>
@@ -5477,13 +4745,7 @@
               </w:rPr>
             </w:pPr>
             <w:r>
-              <w:rPr>
-                <w:b w:val="1"/>
-                <w:bCs w:val="1"/>
-                <w:color w:val="172b4d"/>
-                <w:rtl w:val="0"/>
-              </w:rPr>
-              <w:t xml:space="preserve">Tên chức năng</w:t>
+              <w:t>Tên chức năng</w:t>
             </w:r>
           </w:p>
         </w:tc>
@@ -5512,13 +4774,7 @@
               </w:rPr>
             </w:pPr>
             <w:r>
-              <w:rPr>
-                <w:b w:val="1"/>
-                <w:bCs w:val="1"/>
-                <w:color w:val="172b4d"/>
-                <w:rtl w:val="0"/>
-              </w:rPr>
-              <w:t xml:space="preserve">Phân hệ</w:t>
+              <w:t>Phân hệ</w:t>
             </w:r>
           </w:p>
         </w:tc>
@@ -5547,13 +4803,7 @@
               </w:rPr>
             </w:pPr>
             <w:r>
-              <w:rPr>
-                <w:b w:val="1"/>
-                <w:bCs w:val="1"/>
-                <w:color w:val="172b4d"/>
-                <w:rtl w:val="0"/>
-              </w:rPr>
-              <w:t xml:space="preserve">Tác nhân (Actor)</w:t>
+              <w:t>Tác nhân (Actor)</w:t>
             </w:r>
           </w:p>
         </w:tc>
@@ -5584,10 +4834,7 @@
               <w:rPr/>
             </w:pPr>
             <w:r>
-              <w:rPr>
-                <w:rtl w:val="0"/>
-              </w:rPr>
-              <w:t xml:space="preserve">1</w:t>
+              <w:t>1</w:t>
             </w:r>
           </w:p>
         </w:tc>
@@ -5611,11 +4858,7 @@
               <w:jc w:val="left"/>
               <w:rPr/>
             </w:pPr>
-            <w:r>
-              <w:rPr>
-                <w:rtl w:val="0"/>
-              </w:rPr>
-            </w:r>
+            <w:r/>
           </w:p>
         </w:tc>
         <w:tc>
@@ -5637,11 +4880,7 @@
             <w:pPr>
               <w:rPr/>
             </w:pPr>
-            <w:r>
-              <w:rPr>
-                <w:rtl w:val="0"/>
-              </w:rPr>
-            </w:r>
+            <w:r/>
           </w:p>
         </w:tc>
         <w:tc>
@@ -5663,11 +4902,7 @@
             <w:pPr>
               <w:rPr/>
             </w:pPr>
-            <w:r>
-              <w:rPr>
-                <w:rtl w:val="0"/>
-              </w:rPr>
-            </w:r>
+            <w:r/>
           </w:p>
         </w:tc>
         <w:tc>
@@ -5689,11 +4924,7 @@
             <w:pPr>
               <w:rPr/>
             </w:pPr>
-            <w:r>
-              <w:rPr>
-                <w:rtl w:val="0"/>
-              </w:rPr>
-            </w:r>
+            <w:r/>
           </w:p>
         </w:tc>
       </w:tr>
@@ -5731,24 +4962,15 @@
           <w:vertAlign w:val="baseline"/>
         </w:rPr>
       </w:pPr>
-      <w:r>
-        <w:rPr>
-          <w:rtl w:val="0"/>
-        </w:rPr>
-      </w:r>
+      <w:r/>
     </w:p>
     <w:p>
       <w:pPr>
         <w:pStyle w:val="Heading2"/>
         <w:rPr/>
       </w:pPr>
-      <w:bookmarkStart w:colFirst="0" w:colLast="0" w:name="_heading=h.mcjrgukw7pzu" w:id="16"/>
-      <w:bookmarkEnd w:id="16"/>
-      <w:r>
-        <w:rPr>
-          <w:rtl w:val="0"/>
-        </w:rPr>
-        <w:t xml:space="preserve">3.1. &lt;Tên chức năng&gt;</w:t>
+      <w:r>
+        <w:t>3.1. &lt;Tên chức năng&gt;</w:t>
       </w:r>
     </w:p>
     <w:p>
@@ -5766,20 +4988,8 @@
         <w:pStyle w:val="Heading3"/>
         <w:rPr/>
       </w:pPr>
-      <w:bookmarkStart w:colFirst="0" w:colLast="0" w:name="_heading=h.hlm505yf9rk3" w:id="17"/>
-      <w:bookmarkEnd w:id="17"/>
-      <w:r>
-        <w:rPr>
-          <w:b w:val="1"/>
-          <w:bCs w:val="1"/>
-          <w:rtl w:val="0"/>
-        </w:rPr>
-        <w:t xml:space="preserve">3.1.1. Đặc tả Use Case</w:t>
-      </w:r>
-      <w:r>
-        <w:rPr>
-          <w:rtl w:val="0"/>
-        </w:rPr>
+      <w:r>
+        <w:t>3.1.1. Đặc tả Use Case</w:t>
       </w:r>
     </w:p>
     <w:tbl>
@@ -5825,10 +5035,7 @@
               <w:rPr/>
             </w:pPr>
             <w:r>
-              <w:rPr>
-                <w:rtl w:val="0"/>
-              </w:rPr>
-              <w:t xml:space="preserve">Use Case ID</w:t>
+              <w:t>Use Case ID</w:t>
             </w:r>
           </w:p>
         </w:tc>
@@ -5852,17 +5059,7 @@
               <w:rPr/>
             </w:pPr>
             <w:r>
-              <w:rPr>
-                <w:i w:val="1"/>
-                <w:iCs w:val="1"/>
-                <w:rtl w:val="0"/>
-              </w:rPr>
-              <w:t xml:space="preserve">[Mã chức năng]</w:t>
-            </w:r>
-            <w:r>
-              <w:rPr>
-                <w:rtl w:val="0"/>
-              </w:rPr>
+              <w:t>[Mã chức năng]</w:t>
             </w:r>
           </w:p>
         </w:tc>
@@ -5892,10 +5089,7 @@
               <w:rPr/>
             </w:pPr>
             <w:r>
-              <w:rPr>
-                <w:rtl w:val="0"/>
-              </w:rPr>
-              <w:t xml:space="preserve">Mô tả</w:t>
+              <w:t>Mô tả</w:t>
             </w:r>
           </w:p>
         </w:tc>
@@ -5919,17 +5113,7 @@
               <w:rPr/>
             </w:pPr>
             <w:r>
-              <w:rPr>
-                <w:i w:val="1"/>
-                <w:iCs w:val="1"/>
-                <w:rtl w:val="0"/>
-              </w:rPr>
-              <w:t xml:space="preserve">[Tóm gọn ngắn sự tương tác được thể hiện trong Use Case ]</w:t>
-            </w:r>
-            <w:r>
-              <w:rPr>
-                <w:rtl w:val="0"/>
-              </w:rPr>
+              <w:t>[Tóm gọn ngắn sự tương tác được thể hiện trong Use Case ]</w:t>
             </w:r>
           </w:p>
         </w:tc>
@@ -5959,10 +5143,7 @@
               <w:rPr/>
             </w:pPr>
             <w:r>
-              <w:rPr>
-                <w:rtl w:val="0"/>
-              </w:rPr>
-              <w:t xml:space="preserve">Tác nhân (Actor(s))</w:t>
+              <w:t>Tác nhân (Actor(s))</w:t>
             </w:r>
           </w:p>
         </w:tc>
@@ -6015,28 +5196,7 @@
               </w:rPr>
             </w:pPr>
             <w:r>
-              <w:rPr>
-                <w:rFonts w:ascii="Times New Roman" w:cs="Times New Roman" w:eastAsia="Times New Roman" w:hAnsi="Times New Roman"/>
-                <w:b w:val="0"/>
-                <w:bCs w:val="0"/>
-                <w:i w:val="1"/>
-                <w:iCs w:val="1"/>
-                <w:smallCaps w:val="0"/>
-                <w:strike w:val="0"/>
-                <w:color w:val="000000"/>
-                <w:sz w:val="24"/>
-                <w:szCs w:val="24"/>
-                <w:u w:val="none"/>
-                <w:shd w:fill="auto" w:val="clear"/>
-                <w:vertAlign w:val="baseline"/>
-                <w:rtl w:val="0"/>
-              </w:rPr>
-              <w:t xml:space="preserve">[Những đối tượng thực hiện sự tương tác trong Use Case]</w:t>
-            </w:r>
-            <w:r>
-              <w:rPr>
-                <w:rtl w:val="0"/>
-              </w:rPr>
+              <w:t>[Những đối tượng thực hiện sự tương tác trong Use Case]</w:t>
             </w:r>
           </w:p>
         </w:tc>
@@ -6095,23 +5255,7 @@
               </w:rPr>
             </w:pPr>
             <w:r>
-              <w:rPr>
-                <w:rFonts w:ascii="Times New Roman" w:cs="Times New Roman" w:eastAsia="Times New Roman" w:hAnsi="Times New Roman"/>
-                <w:b w:val="0"/>
-                <w:bCs w:val="0"/>
-                <w:i w:val="0"/>
-                <w:iCs w:val="0"/>
-                <w:smallCaps w:val="0"/>
-                <w:strike w:val="0"/>
-                <w:color w:val="000000"/>
-                <w:sz w:val="24"/>
-                <w:szCs w:val="24"/>
-                <w:u w:val="none"/>
-                <w:shd w:fill="auto" w:val="clear"/>
-                <w:vertAlign w:val="baseline"/>
-                <w:rtl w:val="0"/>
-              </w:rPr>
-              <w:t xml:space="preserve">Sự ưu tiên (Priority)</w:t>
+              <w:t>Sự ưu tiên (Priority)</w:t>
             </w:r>
           </w:p>
         </w:tc>
@@ -6135,17 +5279,7 @@
               <w:rPr/>
             </w:pPr>
             <w:r>
-              <w:rPr>
-                <w:i w:val="1"/>
-                <w:iCs w:val="1"/>
-                <w:rtl w:val="0"/>
-              </w:rPr>
-              <w:t xml:space="preserve">[Mức độ ưu tiên của Use Case so với các Use Case còn lại trong dự án]</w:t>
-            </w:r>
-            <w:r>
-              <w:rPr>
-                <w:rtl w:val="0"/>
-              </w:rPr>
+              <w:t>[Mức độ ưu tiên của Use Case so với các Use Case còn lại trong dự án]</w:t>
             </w:r>
           </w:p>
         </w:tc>
@@ -6175,10 +5309,7 @@
               <w:rPr/>
             </w:pPr>
             <w:r>
-              <w:rPr>
-                <w:rtl w:val="0"/>
-              </w:rPr>
-              <w:t xml:space="preserve">Trigger</w:t>
+              <w:t>Trigger</w:t>
             </w:r>
           </w:p>
         </w:tc>
@@ -6202,17 +5333,7 @@
               <w:rPr/>
             </w:pPr>
             <w:r>
-              <w:rPr>
-                <w:i w:val="1"/>
-                <w:iCs w:val="1"/>
-                <w:rtl w:val="0"/>
-              </w:rPr>
-              <w:t xml:space="preserve">[Điều kiện kích hoạt Use Case xảy ra]</w:t>
-            </w:r>
-            <w:r>
-              <w:rPr>
-                <w:rtl w:val="0"/>
-              </w:rPr>
+              <w:t>[Điều kiện kích hoạt Use Case xảy ra]</w:t>
             </w:r>
           </w:p>
         </w:tc>
@@ -6242,10 +5363,7 @@
               <w:rPr/>
             </w:pPr>
             <w:r>
-              <w:rPr>
-                <w:rtl w:val="0"/>
-              </w:rPr>
-              <w:t xml:space="preserve">Điều kiện cần</w:t>
+              <w:t>Điều kiện cần</w:t>
             </w:r>
           </w:p>
           <w:p>
@@ -6253,10 +5371,7 @@
               <w:rPr/>
             </w:pPr>
             <w:r>
-              <w:rPr>
-                <w:rtl w:val="0"/>
-              </w:rPr>
-              <w:t xml:space="preserve">(Pre - Condition)</w:t>
+              <w:t>(Pre - Condition)</w:t>
             </w:r>
           </w:p>
         </w:tc>
@@ -6280,17 +5395,7 @@
               <w:rPr/>
             </w:pPr>
             <w:r>
-              <w:rPr>
-                <w:i w:val="1"/>
-                <w:iCs w:val="1"/>
-                <w:rtl w:val="0"/>
-              </w:rPr>
-              <w:t xml:space="preserve">[Điều kiện cần để Use Case thực hiện thành công]</w:t>
-            </w:r>
-            <w:r>
-              <w:rPr>
-                <w:rtl w:val="0"/>
-              </w:rPr>
+              <w:t>[Điều kiện cần để Use Case thực hiện thành công]</w:t>
             </w:r>
           </w:p>
         </w:tc>
@@ -6320,10 +5425,7 @@
               <w:rPr/>
             </w:pPr>
             <w:r>
-              <w:rPr>
-                <w:rtl w:val="0"/>
-              </w:rPr>
-              <w:t xml:space="preserve">Điều kiện sau</w:t>
+              <w:t>Điều kiện sau</w:t>
             </w:r>
           </w:p>
           <w:p>
@@ -6331,10 +5433,7 @@
               <w:rPr/>
             </w:pPr>
             <w:r>
-              <w:rPr>
-                <w:rtl w:val="0"/>
-              </w:rPr>
-              <w:t xml:space="preserve">(Post - Condition(s))</w:t>
+              <w:t>(Post - Condition(s))</w:t>
             </w:r>
           </w:p>
         </w:tc>
@@ -6358,17 +5457,7 @@
               <w:rPr/>
             </w:pPr>
             <w:r>
-              <w:rPr>
-                <w:i w:val="1"/>
-                <w:iCs w:val="1"/>
-                <w:rtl w:val="0"/>
-              </w:rPr>
-              <w:t xml:space="preserve">[Những thứ sẽ xuất hiện sau khi Use Case được thực hiện thành công]</w:t>
-            </w:r>
-            <w:r>
-              <w:rPr>
-                <w:rtl w:val="0"/>
-              </w:rPr>
+              <w:t>[Những thứ sẽ xuất hiện sau khi Use Case được thực hiện thành công]</w:t>
             </w:r>
           </w:p>
         </w:tc>
@@ -6398,10 +5487,7 @@
               <w:rPr/>
             </w:pPr>
             <w:r>
-              <w:rPr>
-                <w:rtl w:val="0"/>
-              </w:rPr>
-              <w:t xml:space="preserve">Luồng cơ bản</w:t>
+              <w:t>Luồng cơ bản</w:t>
             </w:r>
           </w:p>
           <w:p>
@@ -6409,10 +5495,7 @@
               <w:rPr/>
             </w:pPr>
             <w:r>
-              <w:rPr>
-                <w:rtl w:val="0"/>
-              </w:rPr>
-              <w:t xml:space="preserve">(Basic Flow)</w:t>
+              <w:t>(Basic Flow)</w:t>
             </w:r>
           </w:p>
         </w:tc>
@@ -6436,17 +5519,7 @@
               <w:rPr/>
             </w:pPr>
             <w:r>
-              <w:rPr>
-                <w:i w:val="1"/>
-                <w:iCs w:val="1"/>
-                <w:rtl w:val="0"/>
-              </w:rPr>
-              <w:t xml:space="preserve">[Luồng tương tác chính giữa các Actor và hệ thống để Use Case thực hiện thành công]</w:t>
-            </w:r>
-            <w:r>
-              <w:rPr>
-                <w:rtl w:val="0"/>
-              </w:rPr>
+              <w:t>[Luồng tương tác chính giữa các Actor và hệ thống để Use Case thực hiện thành công]</w:t>
             </w:r>
           </w:p>
         </w:tc>
@@ -6476,10 +5549,7 @@
               <w:rPr/>
             </w:pPr>
             <w:r>
-              <w:rPr>
-                <w:rtl w:val="0"/>
-              </w:rPr>
-              <w:t xml:space="preserve">Luồng thay thế</w:t>
+              <w:t>Luồng thay thế</w:t>
             </w:r>
           </w:p>
           <w:p>
@@ -6487,10 +5557,7 @@
               <w:rPr/>
             </w:pPr>
             <w:r>
-              <w:rPr>
-                <w:rtl w:val="0"/>
-              </w:rPr>
-              <w:t xml:space="preserve">(Alternative Flow )</w:t>
+              <w:t>(Alternative Flow )</w:t>
             </w:r>
           </w:p>
         </w:tc>
@@ -6514,17 +5581,7 @@
               <w:rPr/>
             </w:pPr>
             <w:r>
-              <w:rPr>
-                <w:i w:val="1"/>
-                <w:iCs w:val="1"/>
-                <w:rtl w:val="0"/>
-              </w:rPr>
-              <w:t xml:space="preserve">[Luồng thương tác thay thế giữa các Actor và hệ thống để Use Case thực hiện thành công]</w:t>
-            </w:r>
-            <w:r>
-              <w:rPr>
-                <w:rtl w:val="0"/>
-              </w:rPr>
+              <w:t>[Luồng thương tác thay thế giữa các Actor và hệ thống để Use Case thực hiện thành công]</w:t>
             </w:r>
           </w:p>
         </w:tc>
@@ -6554,10 +5611,7 @@
               <w:rPr/>
             </w:pPr>
             <w:r>
-              <w:rPr>
-                <w:rtl w:val="0"/>
-              </w:rPr>
-              <w:t xml:space="preserve">Luồng ngoại lệ (Exception Flow)</w:t>
+              <w:t>Luồng ngoại lệ (Exception Flow)</w:t>
             </w:r>
           </w:p>
         </w:tc>
@@ -6581,17 +5635,7 @@
               <w:rPr/>
             </w:pPr>
             <w:r>
-              <w:rPr>
-                <w:i w:val="1"/>
-                <w:iCs w:val="1"/>
-                <w:rtl w:val="0"/>
-              </w:rPr>
-              <w:t xml:space="preserve">[Luồng thương tác ngoại lệ giữa các Actor và hệ thống để Use Case thực hiện thất bại]</w:t>
-            </w:r>
-            <w:r>
-              <w:rPr>
-                <w:rtl w:val="0"/>
-              </w:rPr>
+              <w:t>[Luồng thương tác ngoại lệ giữa các Actor và hệ thống để Use Case thực hiện thất bại]</w:t>
             </w:r>
           </w:p>
         </w:tc>
@@ -6650,23 +5694,7 @@
               </w:rPr>
             </w:pPr>
             <w:r>
-              <w:rPr>
-                <w:rFonts w:ascii="Times New Roman" w:cs="Times New Roman" w:eastAsia="Times New Roman" w:hAnsi="Times New Roman"/>
-                <w:b w:val="0"/>
-                <w:bCs w:val="0"/>
-                <w:i w:val="0"/>
-                <w:iCs w:val="0"/>
-                <w:smallCaps w:val="0"/>
-                <w:strike w:val="0"/>
-                <w:color w:val="000000"/>
-                <w:sz w:val="24"/>
-                <w:szCs w:val="24"/>
-                <w:u w:val="none"/>
-                <w:shd w:fill="auto" w:val="clear"/>
-                <w:vertAlign w:val="baseline"/>
-                <w:rtl w:val="0"/>
-              </w:rPr>
-              <w:t xml:space="preserve">Ràng buộc</w:t>
+              <w:t>Ràng buộc</w:t>
             </w:r>
           </w:p>
           <w:p>
@@ -6703,23 +5731,7 @@
               </w:rPr>
             </w:pPr>
             <w:r>
-              <w:rPr>
-                <w:rFonts w:ascii="Times New Roman" w:cs="Times New Roman" w:eastAsia="Times New Roman" w:hAnsi="Times New Roman"/>
-                <w:b w:val="0"/>
-                <w:bCs w:val="0"/>
-                <w:i w:val="0"/>
-                <w:iCs w:val="0"/>
-                <w:smallCaps w:val="0"/>
-                <w:strike w:val="0"/>
-                <w:color w:val="000000"/>
-                <w:sz w:val="24"/>
-                <w:szCs w:val="24"/>
-                <w:u w:val="none"/>
-                <w:shd w:fill="auto" w:val="clear"/>
-                <w:vertAlign w:val="baseline"/>
-                <w:rtl w:val="0"/>
-              </w:rPr>
-              <w:t xml:space="preserve">(Business Rules)</w:t>
+              <w:t>(Business Rules)</w:t>
             </w:r>
           </w:p>
         </w:tc>
@@ -6743,17 +5755,7 @@
               <w:rPr/>
             </w:pPr>
             <w:r>
-              <w:rPr>
-                <w:i w:val="1"/>
-                <w:iCs w:val="1"/>
-                <w:rtl w:val="0"/>
-              </w:rPr>
-              <w:t xml:space="preserve">[Các quy định về mặt nghiệp vụ mà hệ thống bắt buộc phải làm theo]</w:t>
-            </w:r>
-            <w:r>
-              <w:rPr>
-                <w:rtl w:val="0"/>
-              </w:rPr>
+              <w:t>[Các quy định về mặt nghiệp vụ mà hệ thống bắt buộc phải làm theo]</w:t>
             </w:r>
           </w:p>
         </w:tc>
@@ -6812,23 +5814,7 @@
               </w:rPr>
             </w:pPr>
             <w:r>
-              <w:rPr>
-                <w:rFonts w:ascii="Times New Roman" w:cs="Times New Roman" w:eastAsia="Times New Roman" w:hAnsi="Times New Roman"/>
-                <w:b w:val="0"/>
-                <w:bCs w:val="0"/>
-                <w:i w:val="0"/>
-                <w:iCs w:val="0"/>
-                <w:smallCaps w:val="0"/>
-                <w:strike w:val="0"/>
-                <w:color w:val="000000"/>
-                <w:sz w:val="24"/>
-                <w:szCs w:val="24"/>
-                <w:u w:val="none"/>
-                <w:shd w:fill="auto" w:val="clear"/>
-                <w:vertAlign w:val="baseline"/>
-                <w:rtl w:val="0"/>
-              </w:rPr>
-              <w:t xml:space="preserve">Yêu cầu phi chức năng</w:t>
+              <w:t>Yêu cầu phi chức năng</w:t>
             </w:r>
           </w:p>
           <w:p>
@@ -6865,23 +5851,7 @@
               </w:rPr>
             </w:pPr>
             <w:r>
-              <w:rPr>
-                <w:rFonts w:ascii="Times New Roman" w:cs="Times New Roman" w:eastAsia="Times New Roman" w:hAnsi="Times New Roman"/>
-                <w:b w:val="0"/>
-                <w:bCs w:val="0"/>
-                <w:i w:val="0"/>
-                <w:iCs w:val="0"/>
-                <w:smallCaps w:val="0"/>
-                <w:strike w:val="0"/>
-                <w:color w:val="000000"/>
-                <w:sz w:val="24"/>
-                <w:szCs w:val="24"/>
-                <w:u w:val="none"/>
-                <w:shd w:fill="auto" w:val="clear"/>
-                <w:vertAlign w:val="baseline"/>
-                <w:rtl w:val="0"/>
-              </w:rPr>
-              <w:t xml:space="preserve">(Non-Functional Requirement)</w:t>
+              <w:t>(Non-Functional Requirement)</w:t>
             </w:r>
           </w:p>
         </w:tc>
@@ -6905,17 +5875,7 @@
               <w:rPr/>
             </w:pPr>
             <w:r>
-              <w:rPr>
-                <w:i w:val="1"/>
-                <w:iCs w:val="1"/>
-                <w:rtl w:val="0"/>
-              </w:rPr>
-              <w:t xml:space="preserve">[Các yêu cầu phi chức năng: bảo mật, hiệu suất,...]</w:t>
-            </w:r>
-            <w:r>
-              <w:rPr>
-                <w:rtl w:val="0"/>
-              </w:rPr>
+              <w:t>[Các yêu cầu phi chức năng: bảo mật, hiệu suất,...]</w:t>
             </w:r>
           </w:p>
         </w:tc>
@@ -6977,31 +5937,15 @@
           <w:szCs w:val="21"/>
         </w:rPr>
       </w:pPr>
-      <w:r>
-        <w:rPr>
-          <w:rtl w:val="0"/>
-        </w:rPr>
-      </w:r>
+      <w:r/>
     </w:p>
     <w:p>
       <w:pPr>
         <w:pStyle w:val="Heading3"/>
         <w:rPr/>
       </w:pPr>
-      <w:bookmarkStart w:colFirst="0" w:colLast="0" w:name="_heading=h.gjffcc3w88wl" w:id="18"/>
-      <w:bookmarkEnd w:id="18"/>
-      <w:r>
-        <w:rPr>
-          <w:b w:val="1"/>
-          <w:bCs w:val="1"/>
-          <w:rtl w:val="0"/>
-        </w:rPr>
-        <w:t xml:space="preserve">3.1.2. Sơ đồ luồng chi tiết</w:t>
-      </w:r>
-      <w:r>
-        <w:rPr>
-          <w:rtl w:val="0"/>
-        </w:rPr>
+      <w:r>
+        <w:t>3.1.2. Sơ đồ luồng chi tiết</w:t>
       </w:r>
     </w:p>
     <w:p>
@@ -7023,44 +5967,22 @@
         </w:rPr>
       </w:pPr>
       <w:r>
-        <w:rPr>
-          <w:i w:val="1"/>
-          <w:iCs w:val="1"/>
-          <w:color w:val="172b4d"/>
-          <w:rtl w:val="0"/>
-        </w:rPr>
-        <w:t xml:space="preserve">[Sơ đồ luồng chi tiết của Use Case]</w:t>
+        <w:t>[Sơ đồ luồng chi tiết của Use Case]</w:t>
       </w:r>
     </w:p>
     <w:p>
       <w:pPr>
         <w:rPr/>
       </w:pPr>
-      <w:r>
-        <w:rPr>
-          <w:rtl w:val="0"/>
-        </w:rPr>
-      </w:r>
+      <w:r/>
     </w:p>
     <w:p>
       <w:pPr>
         <w:pStyle w:val="Heading3"/>
         <w:rPr/>
       </w:pPr>
-      <w:bookmarkStart w:colFirst="0" w:colLast="0" w:name="_heading=h.qhqwk3fortz6" w:id="19"/>
-      <w:bookmarkEnd w:id="19"/>
-      <w:r>
-        <w:rPr>
-          <w:b w:val="1"/>
-          <w:bCs w:val="1"/>
-          <w:rtl w:val="0"/>
-        </w:rPr>
-        <w:t xml:space="preserve">3.1.3. Giao diện</w:t>
-      </w:r>
-      <w:r>
-        <w:rPr>
-          <w:rtl w:val="0"/>
-        </w:rPr>
+      <w:r>
+        <w:t>3.1.3. Giao diện</w:t>
       </w:r>
     </w:p>
     <w:p>
@@ -7097,44 +6019,22 @@
         </w:rPr>
       </w:pPr>
       <w:r>
-        <w:rPr>
-          <w:i w:val="1"/>
-          <w:iCs w:val="1"/>
-          <w:color w:val="172b4d"/>
-          <w:rtl w:val="0"/>
-        </w:rPr>
-        <w:t xml:space="preserve">[Giao diên thể hiện trong Use Case]</w:t>
+        <w:t>[Giao diên thể hiện trong Use Case]</w:t>
       </w:r>
     </w:p>
     <w:p>
       <w:pPr>
         <w:rPr/>
       </w:pPr>
-      <w:r>
-        <w:rPr>
-          <w:rtl w:val="0"/>
-        </w:rPr>
-      </w:r>
+      <w:r/>
     </w:p>
     <w:p>
       <w:pPr>
         <w:pStyle w:val="Heading3"/>
         <w:rPr/>
       </w:pPr>
-      <w:bookmarkStart w:colFirst="0" w:colLast="0" w:name="_heading=h.i1xcn1tv6zkf" w:id="20"/>
-      <w:bookmarkEnd w:id="20"/>
-      <w:r>
-        <w:rPr>
-          <w:b w:val="1"/>
-          <w:bCs w:val="1"/>
-          <w:rtl w:val="0"/>
-        </w:rPr>
-        <w:t xml:space="preserve">3.1.4. Mô tả chi tiết</w:t>
-      </w:r>
-      <w:r>
-        <w:rPr>
-          <w:rtl w:val="0"/>
-        </w:rPr>
+      <w:r>
+        <w:t>3.1.4. Mô tả chi tiết</w:t>
       </w:r>
     </w:p>
     <w:p>
@@ -7177,18 +6077,7 @@
         <w:rPr/>
       </w:pPr>
       <w:r>
-        <w:rPr>
-          <w:i w:val="1"/>
-          <w:iCs w:val="1"/>
-          <w:color w:val="172b4d"/>
-          <w:rtl w:val="0"/>
-        </w:rPr>
-        <w:t xml:space="preserve">[Mô tả chi tiết các trường thông tin trong Use Case]</w:t>
-      </w:r>
-      <w:r>
-        <w:rPr>
-          <w:rtl w:val="0"/>
-        </w:rPr>
+        <w:t>[Mô tả chi tiết các trường thông tin trong Use Case]</w:t>
       </w:r>
     </w:p>
     <w:tbl>
@@ -7244,12 +6133,7 @@
               </w:rPr>
             </w:pPr>
             <w:r>
-              <w:rPr>
-                <w:b w:val="1"/>
-                <w:bCs w:val="1"/>
-                <w:rtl w:val="0"/>
-              </w:rPr>
-              <w:t xml:space="preserve">Tên tiếng Việt</w:t>
+              <w:t>Tên tiếng Việt</w:t>
             </w:r>
           </w:p>
         </w:tc>
@@ -7277,12 +6161,7 @@
               </w:rPr>
             </w:pPr>
             <w:r>
-              <w:rPr>
-                <w:b w:val="1"/>
-                <w:bCs w:val="1"/>
-                <w:rtl w:val="0"/>
-              </w:rPr>
-              <w:t xml:space="preserve">Tên tiếng Anh</w:t>
+              <w:t>Tên tiếng Anh</w:t>
             </w:r>
           </w:p>
         </w:tc>
@@ -7310,12 +6189,7 @@
               </w:rPr>
             </w:pPr>
             <w:r>
-              <w:rPr>
-                <w:b w:val="1"/>
-                <w:bCs w:val="1"/>
-                <w:rtl w:val="0"/>
-              </w:rPr>
-              <w:t xml:space="preserve">Loại</w:t>
+              <w:t>Loại</w:t>
             </w:r>
           </w:p>
         </w:tc>
@@ -7343,12 +6217,7 @@
               </w:rPr>
             </w:pPr>
             <w:r>
-              <w:rPr>
-                <w:b w:val="1"/>
-                <w:bCs w:val="1"/>
-                <w:rtl w:val="0"/>
-              </w:rPr>
-              <w:t xml:space="preserve">Bắt buộc?</w:t>
+              <w:t>Bắt buộc?</w:t>
             </w:r>
           </w:p>
         </w:tc>
@@ -7376,12 +6245,7 @@
               </w:rPr>
             </w:pPr>
             <w:r>
-              <w:rPr>
-                <w:b w:val="1"/>
-                <w:bCs w:val="1"/>
-                <w:rtl w:val="0"/>
-              </w:rPr>
-              <w:t xml:space="preserve">Mô tả</w:t>
+              <w:t>Mô tả</w:t>
             </w:r>
           </w:p>
         </w:tc>
@@ -7410,11 +6274,7 @@
             <w:pPr>
               <w:rPr/>
             </w:pPr>
-            <w:r>
-              <w:rPr>
-                <w:rtl w:val="0"/>
-              </w:rPr>
-            </w:r>
+            <w:r/>
           </w:p>
         </w:tc>
         <w:tc>
@@ -7436,11 +6296,7 @@
             <w:pPr>
               <w:rPr/>
             </w:pPr>
-            <w:r>
-              <w:rPr>
-                <w:rtl w:val="0"/>
-              </w:rPr>
-            </w:r>
+            <w:r/>
           </w:p>
         </w:tc>
         <w:tc>
@@ -7462,11 +6318,7 @@
             <w:pPr>
               <w:rPr/>
             </w:pPr>
-            <w:r>
-              <w:rPr>
-                <w:rtl w:val="0"/>
-              </w:rPr>
-            </w:r>
+            <w:r/>
           </w:p>
         </w:tc>
         <w:tc>
@@ -7488,11 +6340,7 @@
             <w:pPr>
               <w:rPr/>
             </w:pPr>
-            <w:r>
-              <w:rPr>
-                <w:rtl w:val="0"/>
-              </w:rPr>
-            </w:r>
+            <w:r/>
           </w:p>
         </w:tc>
         <w:tc>
@@ -7514,11 +6362,7 @@
             <w:pPr>
               <w:rPr/>
             </w:pPr>
-            <w:r>
-              <w:rPr>
-                <w:rtl w:val="0"/>
-              </w:rPr>
-            </w:r>
+            <w:r/>
           </w:p>
         </w:tc>
       </w:tr>
@@ -7561,31 +6405,15 @@
           <w:pgMar w:bottom="1134" w:top="1134" w:left="1701" w:right="992" w:header="720" w:footer="720"/>
         </w:sectPr>
       </w:pPr>
-      <w:r>
-        <w:rPr>
-          <w:rtl w:val="0"/>
-        </w:rPr>
-      </w:r>
+      <w:r/>
     </w:p>
     <w:p>
       <w:pPr>
         <w:pStyle w:val="Heading1"/>
         <w:rPr/>
       </w:pPr>
-      <w:bookmarkStart w:colFirst="0" w:colLast="0" w:name="_heading=h.1k4gtqjsu7rl" w:id="21"/>
-      <w:bookmarkEnd w:id="21"/>
-      <w:r>
-        <w:rPr>
-          <w:b w:val="1"/>
-          <w:bCs w:val="1"/>
-          <w:rtl w:val="0"/>
-        </w:rPr>
-        <w:t xml:space="preserve">PHẦN 4: CÁC COMPONENT, THÔNG BÁO, CẢNH BÁO</w:t>
-      </w:r>
-      <w:r>
-        <w:rPr>
-          <w:rtl w:val="0"/>
-        </w:rPr>
+      <w:r>
+        <w:t>PHẦN 4: CÁC COMPONENT, THÔNG BÁO, CẢNH BÁO</w:t>
       </w:r>
     </w:p>
     <w:p>
@@ -7629,32 +6457,16 @@
           <w:pgMar w:bottom="1134" w:top="1134" w:left="1701" w:right="992" w:header="720" w:footer="720"/>
         </w:sectPr>
       </w:pPr>
-      <w:r>
-        <w:rPr>
-          <w:rtl w:val="0"/>
-        </w:rPr>
-      </w:r>
+      <w:r/>
     </w:p>
     <w:p>
       <w:pPr>
         <w:pStyle w:val="Heading1"/>
         <w:rPr/>
       </w:pPr>
-      <w:bookmarkStart w:colFirst="0" w:colLast="0" w:name="_heading=h.lya5fto65aym" w:id="22"/>
-      <w:bookmarkEnd w:id="22"/>
-      <w:r>
-        <w:rPr>
-          <w:b w:val="1"/>
-          <w:bCs w:val="1"/>
-          <w:rtl w:val="0"/>
-        </w:rPr>
+      <w:r>
         <w:t xml:space="preserve">PHẦN 5: LINK ISSUE </w:t>
       </w:r>
-      <w:r>
-        <w:rPr>
-          <w:rtl w:val="0"/>
-        </w:rPr>
-      </w:r>
     </w:p>
     <w:p>
       <w:pPr>
@@ -7718,90 +6530,242 @@
       <w:pPr>
         <w:rPr/>
       </w:pPr>
-      <w:r>
-        <w:rPr>
-          <w:rtl w:val="0"/>
-        </w:rPr>
-      </w:r>
-    </w:p>
-    <w:p/>
-    <w:p/>
-    <w:p/>
-    <w:p/>
-    <w:p/>
-    <w:p/>
-    <w:p/>
-    <w:p/>
-    <w:p/>
-    <w:p/>
-    <w:p/>
-    <w:p/>
-    <w:p/>
-    <w:p/>
-    <w:p/>
-    <w:p/>
-    <w:p/>
-    <w:p/>
-    <w:p/>
-    <w:p/>
-    <w:p/>
-    <w:p/>
-    <w:p/>
-    <w:p/>
-    <w:p/>
-    <w:p/>
-    <w:p/>
-    <w:p/>
-    <w:p/>
-    <w:p/>
-    <w:p/>
-    <w:p/>
-    <w:p/>
-    <w:p/>
-    <w:p/>
-    <w:p/>
-    <w:p/>
-    <w:p/>
-    <w:p/>
-    <w:p/>
-    <w:p/>
-    <w:p/>
-    <w:p/>
-    <w:p/>
-    <w:p/>
-    <w:p/>
-    <w:p/>
-    <w:p/>
-    <w:p/>
-    <w:p/>
-    <w:p/>
-    <w:p/>
-    <w:p/>
-    <w:p/>
-    <w:p/>
-    <w:p/>
-    <w:p/>
-    <w:p/>
-    <w:p/>
-    <w:p/>
-    <w:p/>
-    <w:p/>
-    <w:p/>
-    <w:p/>
-    <w:p/>
-    <w:p/>
-    <w:p/>
-    <w:p/>
-    <w:p/>
-    <w:p/>
-    <w:p/>
-    <w:p/>
-    <w:p/>
-    <w:p/>
-    <w:p/>
-    <w:p/>
-    <w:p/>
-    <w:p/>
+      <w:r/>
+    </w:p>
+    <w:p>
+      <w:r/>
+    </w:p>
+    <w:p>
+      <w:r/>
+    </w:p>
+    <w:p>
+      <w:r/>
+    </w:p>
+    <w:p>
+      <w:r/>
+    </w:p>
+    <w:p>
+      <w:r/>
+    </w:p>
+    <w:p>
+      <w:r/>
+    </w:p>
+    <w:p>
+      <w:r/>
+    </w:p>
+    <w:p>
+      <w:r/>
+    </w:p>
+    <w:p>
+      <w:r/>
+    </w:p>
+    <w:p>
+      <w:r/>
+    </w:p>
+    <w:p>
+      <w:r/>
+    </w:p>
+    <w:p>
+      <w:r/>
+    </w:p>
+    <w:p>
+      <w:r/>
+    </w:p>
+    <w:p>
+      <w:r/>
+    </w:p>
+    <w:p>
+      <w:r/>
+    </w:p>
+    <w:p>
+      <w:r/>
+    </w:p>
+    <w:p>
+      <w:r/>
+    </w:p>
+    <w:p>
+      <w:r/>
+    </w:p>
+    <w:p>
+      <w:r/>
+    </w:p>
+    <w:p>
+      <w:r/>
+    </w:p>
+    <w:p>
+      <w:r/>
+    </w:p>
+    <w:p>
+      <w:r/>
+    </w:p>
+    <w:p>
+      <w:r/>
+    </w:p>
+    <w:p>
+      <w:r/>
+    </w:p>
+    <w:p>
+      <w:r/>
+    </w:p>
+    <w:p>
+      <w:r/>
+    </w:p>
+    <w:p>
+      <w:r/>
+    </w:p>
+    <w:p>
+      <w:r/>
+    </w:p>
+    <w:p>
+      <w:r/>
+    </w:p>
+    <w:p>
+      <w:r/>
+    </w:p>
+    <w:p>
+      <w:r/>
+    </w:p>
+    <w:p>
+      <w:r/>
+    </w:p>
+    <w:p>
+      <w:r/>
+    </w:p>
+    <w:p>
+      <w:r/>
+    </w:p>
+    <w:p>
+      <w:r/>
+    </w:p>
+    <w:p>
+      <w:r/>
+    </w:p>
+    <w:p>
+      <w:r/>
+    </w:p>
+    <w:p>
+      <w:r/>
+    </w:p>
+    <w:p>
+      <w:r/>
+    </w:p>
+    <w:p>
+      <w:r/>
+    </w:p>
+    <w:p>
+      <w:r/>
+    </w:p>
+    <w:p>
+      <w:r/>
+    </w:p>
+    <w:p>
+      <w:r/>
+    </w:p>
+    <w:p>
+      <w:r/>
+    </w:p>
+    <w:p>
+      <w:r/>
+    </w:p>
+    <w:p>
+      <w:r/>
+    </w:p>
+    <w:p>
+      <w:r/>
+    </w:p>
+    <w:p>
+      <w:r/>
+    </w:p>
+    <w:p>
+      <w:r/>
+    </w:p>
+    <w:p>
+      <w:r/>
+    </w:p>
+    <w:p>
+      <w:r/>
+    </w:p>
+    <w:p>
+      <w:r/>
+    </w:p>
+    <w:p>
+      <w:r/>
+    </w:p>
+    <w:p>
+      <w:r/>
+    </w:p>
+    <w:p>
+      <w:r/>
+    </w:p>
+    <w:p>
+      <w:r/>
+    </w:p>
+    <w:p>
+      <w:r/>
+    </w:p>
+    <w:p>
+      <w:r/>
+    </w:p>
+    <w:p>
+      <w:r/>
+    </w:p>
+    <w:p>
+      <w:r/>
+    </w:p>
+    <w:p>
+      <w:r/>
+    </w:p>
+    <w:p>
+      <w:r/>
+    </w:p>
+    <w:p>
+      <w:r/>
+    </w:p>
+    <w:p>
+      <w:r/>
+    </w:p>
+    <w:p>
+      <w:r/>
+    </w:p>
+    <w:p>
+      <w:r/>
+    </w:p>
+    <w:p>
+      <w:r/>
+    </w:p>
+    <w:p>
+      <w:r/>
+    </w:p>
+    <w:p>
+      <w:r/>
+    </w:p>
+    <w:p>
+      <w:r/>
+    </w:p>
+    <w:p>
+      <w:r/>
+    </w:p>
+    <w:p>
+      <w:r/>
+    </w:p>
+    <w:p>
+      <w:r/>
+    </w:p>
+    <w:p>
+      <w:r/>
+    </w:p>
+    <w:p>
+      <w:r/>
+    </w:p>
+    <w:p>
+      <w:r/>
+    </w:p>
+    <w:p>
+      <w:r/>
+    </w:p>
+    <w:p>
+      <w:r/>
+    </w:p>
     <w:sectPr>
       <w:type w:val="nextPage"/>
       <w:pgSz w:h="16840" w:w="11907" w:orient="portrait"/>
@@ -7809,6 +6773,28 @@
     </w:sectPr>
   </w:body>
 </w:document>
+</file>
+
+<file path=word/footer1.xml><?xml version="1.0" encoding="utf-8"?>
+<w:ftr xmlns:m="http://schemas.openxmlformats.org/officeDocument/2006/math" xmlns:mc="http://schemas.openxmlformats.org/markup-compatibility/2006" xmlns:mo="http://schemas.microsoft.com/office/mac/office/2008/main" xmlns:mv="urn:schemas-microsoft-com:mac:vml" xmlns:o="urn:schemas-microsoft-com:office:office" xmlns:r="http://schemas.openxmlformats.org/officeDocument/2006/relationships" xmlns:v="urn:schemas-microsoft-com:vml" xmlns:w10="urn:schemas-microsoft-com:office:word" xmlns:w14="http://schemas.microsoft.com/office/word/2010/wordml" xmlns:w="http://schemas.openxmlformats.org/wordprocessingml/2006/main" xmlns:wne="http://schemas.microsoft.com/office/word/2006/wordml" xmlns:wp14="http://schemas.microsoft.com/office/word/2010/wordprocessingDrawing" xmlns:wp="http://schemas.openxmlformats.org/drawingml/2006/wordprocessingDrawing" xmlns:wpc="http://schemas.microsoft.com/office/word/2010/wordprocessingCanvas" xmlns:wpg="http://schemas.microsoft.com/office/word/2010/wordprocessingGroup" xmlns:wpi="http://schemas.microsoft.com/office/word/2010/wordprocessingInk" xmlns:wps="http://schemas.microsoft.com/office/word/2010/wordprocessingShape" mc:Ignorable="w14 wp14">
+  <w:p>
+    <w:pPr>
+      <w:pStyle w:val="Footer"/>
+    </w:pPr>
+    <w:r/>
+  </w:p>
+</w:ftr>
+</file>
+
+<file path=word/header1.xml><?xml version="1.0" encoding="utf-8"?>
+<w:hdr xmlns:m="http://schemas.openxmlformats.org/officeDocument/2006/math" xmlns:mc="http://schemas.openxmlformats.org/markup-compatibility/2006" xmlns:mo="http://schemas.microsoft.com/office/mac/office/2008/main" xmlns:mv="urn:schemas-microsoft-com:mac:vml" xmlns:o="urn:schemas-microsoft-com:office:office" xmlns:r="http://schemas.openxmlformats.org/officeDocument/2006/relationships" xmlns:v="urn:schemas-microsoft-com:vml" xmlns:w10="urn:schemas-microsoft-com:office:word" xmlns:w14="http://schemas.microsoft.com/office/word/2010/wordml" xmlns:w="http://schemas.openxmlformats.org/wordprocessingml/2006/main" xmlns:wne="http://schemas.microsoft.com/office/word/2006/wordml" xmlns:wp14="http://schemas.microsoft.com/office/word/2010/wordprocessingDrawing" xmlns:wp="http://schemas.openxmlformats.org/drawingml/2006/wordprocessingDrawing" xmlns:wpc="http://schemas.microsoft.com/office/word/2010/wordprocessingCanvas" xmlns:wpg="http://schemas.microsoft.com/office/word/2010/wordprocessingGroup" xmlns:wpi="http://schemas.microsoft.com/office/word/2010/wordprocessingInk" xmlns:wps="http://schemas.microsoft.com/office/word/2010/wordprocessingShape" mc:Ignorable="w14 wp14">
+  <w:p>
+    <w:pPr>
+      <w:pStyle w:val="Header"/>
+    </w:pPr>
+    <w:r/>
+  </w:p>
+</w:hdr>
 </file>
 
 <file path=word/numbering.xml><?xml version="1.0" encoding="utf-8"?>

</xml_diff>